<commit_message>
Revise all course materials for AI-aligned RPS 2026
</commit_message>
<xml_diff>
--- a/@Materi Kuliah/Materi_ADW_Tingkat_Lanjut/Kontrak_Perkuliahan_ADWTL_S2_Statistika_Terapan.docx
+++ b/@Materi Kuliah/Materi_ADW_Tingkat_Lanjut/Kontrak_Perkuliahan_ADWTL_S2_Statistika_Terapan.docx
@@ -20,41 +20,6 @@
           <w:color w:val="000000" w:themeColor="text1"/>
           <w:lang w:val="id-ID"/>
         </w:rPr>
-        <w:drawing>
-          <wp:inline distT="0" distB="0" distL="0" distR="0" wp14:anchorId="658FE8BF" wp14:editId="360E17FC">
-            <wp:extent cx="7556500" cy="10680700"/>
-            <wp:effectExtent l="0" t="0" r="0" b="0"/>
-            <wp:docPr id="1217641341" name="Picture 3"/>
-            <wp:cNvGraphicFramePr>
-              <a:graphicFrameLocks xmlns:a="http://schemas.openxmlformats.org/drawingml/2006/main" noChangeAspect="1"/>
-            </wp:cNvGraphicFramePr>
-            <a:graphic xmlns:a="http://schemas.openxmlformats.org/drawingml/2006/main">
-              <a:graphicData uri="http://schemas.openxmlformats.org/drawingml/2006/picture">
-                <pic:pic xmlns:pic="http://schemas.openxmlformats.org/drawingml/2006/picture">
-                  <pic:nvPicPr>
-                    <pic:cNvPr id="1217641341" name="Picture 1217641341"/>
-                    <pic:cNvPicPr/>
-                  </pic:nvPicPr>
-                  <pic:blipFill>
-                    <a:blip r:embed="rId8"/>
-                    <a:stretch>
-                      <a:fillRect/>
-                    </a:stretch>
-                  </pic:blipFill>
-                  <pic:spPr>
-                    <a:xfrm>
-                      <a:off x="0" y="0"/>
-                      <a:ext cx="7556500" cy="10680700"/>
-                    </a:xfrm>
-                    <a:prstGeom prst="rect">
-                      <a:avLst/>
-                    </a:prstGeom>
-                  </pic:spPr>
-                </pic:pic>
-              </a:graphicData>
-            </a:graphic>
-          </wp:inline>
-        </w:drawing>
       </w:r>
     </w:p>
     <w:p>
@@ -68,7 +33,7 @@
         </w:rPr>
         <w:sectPr>
           <w:pgSz w:w="11906" w:h="16838"/>
-          <w:pgMar w:top="0" w:right="0" w:bottom="0" w:left="0" w:header="720" w:footer="720" w:gutter="0"/>
+          <w:pgMar w:top="1008" w:right="0" w:bottom="1008" w:left="0" w:header="720" w:footer="720" w:gutter="0"/>
           <w:cols w:space="720"/>
           <w:docGrid w:linePitch="360"/>
         </w:sectPr>
@@ -94,7 +59,6 @@
           <w:sz w:val="44"/>
           <w:lang w:val="id-ID"/>
         </w:rPr>
-        <w:lastRenderedPageBreak/>
         <w:t>KONTRAK PERKULIAHAN</w:t>
       </w:r>
     </w:p>
@@ -1130,7 +1094,6 @@
           <w:color w:val="000000" w:themeColor="text1"/>
           <w:lang w:val="id-ID"/>
         </w:rPr>
-        <w:br w:type="page"/>
       </w:r>
     </w:p>
     <w:p>
@@ -1151,7 +1114,6 @@
           <w:color w:val="000000" w:themeColor="text1"/>
           <w:lang w:val="id-ID"/>
         </w:rPr>
-        <w:lastRenderedPageBreak/>
         <w:t>1. Latar Belakang dan Deskripsi Mata Kuliah</w:t>
       </w:r>
     </w:p>
@@ -2303,7 +2265,6 @@
           <w:color w:val="000000" w:themeColor="text1"/>
           <w:lang w:val="id-ID"/>
         </w:rPr>
-        <w:br w:type="page"/>
       </w:r>
     </w:p>
     <w:tbl>
@@ -3494,7 +3455,7 @@
           <w:headerReference w:type="default" r:id="rId9"/>
           <w:footerReference w:type="default" r:id="rId10"/>
           <w:pgSz w:w="11906" w:h="16838"/>
-          <w:pgMar w:top="1134" w:right="1021" w:bottom="1179" w:left="1021" w:header="567" w:footer="720" w:gutter="0"/>
+          <w:pgMar w:top="1008" w:right="1021" w:bottom="1008" w:left="1021" w:header="567" w:footer="720" w:gutter="0"/>
           <w:pgNumType w:start="1"/>
           <w:cols w:space="720"/>
           <w:docGrid w:linePitch="360"/>
@@ -3519,7 +3480,6 @@
           <w:color w:val="000000" w:themeColor="text1"/>
           <w:lang w:val="id-ID"/>
         </w:rPr>
-        <w:lastRenderedPageBreak/>
         <w:t>5. Rencana Pembelajaran Mingguan</w:t>
       </w:r>
     </w:p>
@@ -6659,7 +6619,7 @@
           <w:headerReference w:type="default" r:id="rId11"/>
           <w:footerReference w:type="default" r:id="rId12"/>
           <w:pgSz w:w="16838" w:h="11906" w:orient="landscape"/>
-          <w:pgMar w:top="737" w:right="709" w:bottom="680" w:left="709" w:header="720" w:footer="720" w:gutter="0"/>
+          <w:pgMar w:top="1008" w:right="709" w:bottom="1008" w:left="709" w:header="720" w:footer="720" w:gutter="0"/>
           <w:cols w:space="720"/>
           <w:docGrid w:linePitch="360"/>
         </w:sectPr>
@@ -6683,7 +6643,6 @@
           <w:color w:val="000000" w:themeColor="text1"/>
           <w:lang w:val="id-ID"/>
         </w:rPr>
-        <w:lastRenderedPageBreak/>
         <w:t>6. Sistem Penilaian</w:t>
       </w:r>
     </w:p>
@@ -9105,7 +9064,6 @@
           <w:color w:val="000000" w:themeColor="text1"/>
           <w:lang w:val="id-ID"/>
         </w:rPr>
-        <w:lastRenderedPageBreak/>
         <w:t>7. Tata Tertib Perkuliahan</w:t>
       </w:r>
     </w:p>
@@ -10091,7 +10049,6 @@
           <w:color w:val="000000" w:themeColor="text1"/>
           <w:lang w:val="id-ID"/>
         </w:rPr>
-        <w:lastRenderedPageBreak/>
         <w:t>8.1 Lembar Persetujuan</w:t>
       </w:r>
     </w:p>
@@ -11519,7 +11476,6 @@
           <w:sz w:val="18"/>
           <w:lang w:val="id-ID"/>
         </w:rPr>
-        <w:lastRenderedPageBreak/>
         <w:t>Breiman, L. (2001). Random Forests. Machine Learning, 45, 5–32.</w:t>
       </w:r>
     </w:p>
@@ -11675,14 +11631,231 @@
         </w:rPr>
       </w:pPr>
     </w:p>
-    <w:sectPr>
-      <w:headerReference w:type="default" r:id="rId13"/>
-      <w:footerReference w:type="default" r:id="rId14"/>
-      <w:pgSz w:w="11906" w:h="16838"/>
-      <w:pgMar w:top="964" w:right="1020" w:bottom="850" w:left="1020" w:header="720" w:footer="720" w:gutter="0"/>
-      <w:cols w:space="720"/>
-      <w:docGrid w:linePitch="360"/>
-    </w:sectPr>
+    <w:p>
+      <w:r/>
+    </w:p>
+    <w:p>
+      <w:r/>
+    </w:p>
+    <w:p>
+      <w:r/>
+    </w:p>
+    <w:p>
+      <w:r/>
+    </w:p>
+    <w:p>
+      <w:r/>
+    </w:p>
+    <w:p>
+      <w:r/>
+    </w:p>
+    <w:p>
+      <w:r>
+        <w:br w:type="page"/>
+      </w:r>
+    </w:p>
+    <w:p>
+      <w:pPr>
+        <w:pStyle w:val="Heading1"/>
+      </w:pPr>
+      <w:r>
+        <w:rPr>
+          <w:b/>
+          <w:color w:val="17395C"/>
+          <w:sz w:val="32"/>
+        </w:rPr>
+        <w:t>PENYELARASAN KONTRAK DENGAN RPS REVISI AI 2026</w:t>
+      </w:r>
+    </w:p>
+    <w:p>
+      <w:r>
+        <w:t>Kontrak perkuliahan Analisis Deret Waktu Tingkat Lanjut ini mengikuti RPS Revisi AI 2026. Rumusan CPL tidak diubah. AI berfungsi sebagai alat bantu untuk mempercepat ketercapaian CPMK/Sub-CPMK, bukan pengganti penalaran statistika, keputusan metodologis, atau tanggung jawab akademik.</w:t>
+      </w:r>
+    </w:p>
+    <w:p>
+      <w:pPr>
+        <w:pStyle w:val="Heading2"/>
+      </w:pPr>
+      <w:r>
+        <w:t>CPMK yang dipercepat melalui dukungan AI</w:t>
+      </w:r>
+    </w:p>
+    <w:p>
+      <w:pPr>
+        <w:pStyle w:val="ListBullet"/>
+      </w:pPr>
+      <w:r>
+        <w:t>CPMK1: Mampu menganalisis karakteristik data, asumsi, dan permasalahan yang relevan dengan Analisis Deret Waktu Tingkat Lanjut.</w:t>
+      </w:r>
+    </w:p>
+    <w:p>
+      <w:pPr>
+        <w:pStyle w:val="ListBullet"/>
+      </w:pPr>
+      <w:r>
+        <w:t>CPMK2: Mampu mengevaluasi dan memilih metode Analisis Deret Waktu Tingkat Lanjut yang tepat sesuai tujuan, desain data, dan konteks penerapan.</w:t>
+      </w:r>
+    </w:p>
+    <w:p>
+      <w:pPr>
+        <w:pStyle w:val="ListBullet"/>
+      </w:pPr>
+      <w:r>
+        <w:t>CPMK3: Mampu mengimplementasikan, mendiagnosis, dan memvalidasi analisis Analisis Deret Waktu Tingkat Lanjut menggunakan perangkat lunak statistika.</w:t>
+      </w:r>
+    </w:p>
+    <w:p>
+      <w:pPr>
+        <w:pStyle w:val="ListBullet"/>
+      </w:pPr>
+      <w:r>
+        <w:t>CPMK4: Mampu menyintesis proyek/riset Analisis Deret Waktu Tingkat Lanjut secara mandiri serta mengomunikasikan hasil, ketidakpastian, dan keterbatasannya.</w:t>
+      </w:r>
+    </w:p>
+    <w:p>
+      <w:pPr>
+        <w:pStyle w:val="Heading2"/>
+      </w:pPr>
+      <w:r>
+        <w:t>Integrasi AI kontekstual</w:t>
+      </w:r>
+    </w:p>
+    <w:p>
+      <w:pPr>
+        <w:pStyle w:val="ListBullet"/>
+      </w:pPr>
+      <w:r>
+        <w:t>Perbandingan ARIMA/ARFIMA/VAR/GSTAR dengan gradient boosting, recurrent neural network, transformer, dan model hibrida untuk deret waktu.</w:t>
+      </w:r>
+    </w:p>
+    <w:p>
+      <w:pPr>
+        <w:pStyle w:val="ListBullet"/>
+      </w:pPr>
+      <w:r>
+        <w:t>Rolling-origin evaluation, probabilistic forecasting, interval prediction, calibration, deteksi concept drift, dan interpretabilitas temporal.</w:t>
+      </w:r>
+    </w:p>
+    <w:p>
+      <w:pPr>
+        <w:pStyle w:val="ListBullet"/>
+      </w:pPr>
+      <w:r>
+        <w:t>Proyek peramalan data nyata yang menilai bukan hanya akurasi, tetapi juga stabilitas, ketidakpastian, biaya kesalahan, dan relevansi keputusan.</w:t>
+      </w:r>
+    </w:p>
+    <w:p>
+      <w:pPr>
+        <w:pStyle w:val="Heading2"/>
+      </w:pPr>
+      <w:r>
+        <w:t>Aturan penggunaan dan bukti yang wajib diserahkan</w:t>
+      </w:r>
+    </w:p>
+    <w:p>
+      <w:pPr>
+        <w:pStyle w:val="ListNumber"/>
+      </w:pPr>
+      <w:r>
+        <w:t>AI boleh digunakan untuk eksplorasi, penyusunan alternatif, pemeriksaan kode, simulasi, atau umpan balik awal sesuai instruksi dosen.</w:t>
+      </w:r>
+    </w:p>
+    <w:p>
+      <w:pPr>
+        <w:pStyle w:val="ListNumber"/>
+      </w:pPr>
+      <w:r>
+        <w:t>Setiap penggunaan AI wajib disertai pernyataan penggunaan, prompt log ringkas, sumber, versi alat, perubahan yang dilakukan, dan bukti verifikasi mandiri.</w:t>
+      </w:r>
+    </w:p>
+    <w:p>
+      <w:pPr>
+        <w:pStyle w:val="ListNumber"/>
+      </w:pPr>
+      <w:r>
+        <w:t>Keluaran wajib diperiksa terhadap asumsi metode, sumber primer, hasil numerik, diagnostik, ketidakpastian, robustness, bias/fairness, privasi, dan konteks.</w:t>
+      </w:r>
+    </w:p>
+    <w:p>
+      <w:pPr>
+        <w:pStyle w:val="ListNumber"/>
+      </w:pPr>
+      <w:r>
+        <w:t>Data pribadi, rahasia, soal asesmen tertutup, materi berhak cipta tanpa izin, dan kredensial tidak boleh dimasukkan ke layanan AI yang tidak disetujui.</w:t>
+      </w:r>
+    </w:p>
+    <w:p>
+      <w:pPr>
+        <w:pStyle w:val="ListNumber"/>
+      </w:pPr>
+      <w:r>
+        <w:t>Pada asesmen yang dinyatakan tanpa AI, mahasiswa wajib menaati pembatasan tersebut. Mahasiswa selalu wajib mampu menjelaskan seluruh hasil secara mandiri.</w:t>
+      </w:r>
+    </w:p>
+    <w:p>
+      <w:pPr>
+        <w:pStyle w:val="Heading2"/>
+      </w:pPr>
+      <w:r>
+        <w:t>Rubrik minimum asesmen berbantuan AI</w:t>
+      </w:r>
+    </w:p>
+    <w:p>
+      <w:pPr>
+        <w:pStyle w:val="ListBullet"/>
+      </w:pPr>
+      <w:r>
+        <w:rPr>
+          <w:b/>
+        </w:rPr>
+        <w:t xml:space="preserve">Ketepatan metodologi (35%) — </w:t>
+      </w:r>
+      <w:r>
+        <w:t>Asumsi, metode, derivasi/kode, dan inferensi benar serta sesuai konteks.</w:t>
+      </w:r>
+    </w:p>
+    <w:p>
+      <w:pPr>
+        <w:pStyle w:val="ListBullet"/>
+      </w:pPr>
+      <w:r>
+        <w:rPr>
+          <w:b/>
+        </w:rPr>
+        <w:t xml:space="preserve">Validasi dan ketidakpastian (25%) — </w:t>
+      </w:r>
+      <w:r>
+        <w:t>Hasil diuji ulang; diagnostik, robustness, ketidakpastian, dan keterbatasan dibahas.</w:t>
+      </w:r>
+    </w:p>
+    <w:p>
+      <w:pPr>
+        <w:pStyle w:val="ListBullet"/>
+      </w:pPr>
+      <w:r>
+        <w:rPr>
+          <w:b/>
+        </w:rPr>
+        <w:t xml:space="preserve">Reproducibility dan audit trail (20%) — </w:t>
+      </w:r>
+      <w:r>
+        <w:t>Data dictionary, kode/notebook, versi alat, prompt log, sumber, dan jejak agen memadai.</w:t>
+      </w:r>
+    </w:p>
+    <w:p>
+      <w:pPr>
+        <w:pStyle w:val="ListBullet"/>
+      </w:pPr>
+      <w:r>
+        <w:rPr>
+          <w:b/>
+        </w:rPr>
+        <w:t xml:space="preserve">Responsible AI dan komunikasi (20%) — </w:t>
+      </w:r>
+      <w:r>
+        <w:t>Privasi, fairness, transparansi, human oversight, dampak, dan komunikasi dipenuhi.</w:t>
+      </w:r>
+    </w:p>
   </w:body>
 </w:document>
 </file>

</xml_diff>

<commit_message>
Restore ADW course contract cover
</commit_message>
<xml_diff>
--- a/@Materi Kuliah/Materi_ADW_Tingkat_Lanjut/Kontrak_Perkuliahan_ADWTL_S2_Statistika_Terapan.docx
+++ b/@Materi Kuliah/Materi_ADW_Tingkat_Lanjut/Kontrak_Perkuliahan_ADWTL_S2_Statistika_Terapan.docx
@@ -1,6 +1,6 @@
 
 <file path=word/document.xml><?xml version="1.0" encoding="utf-8"?>
-<w:document xmlns:wpc="http://schemas.microsoft.com/office/word/2010/wordprocessingCanvas" xmlns:cx="http://schemas.microsoft.com/office/drawing/2014/chartex" xmlns:cx1="http://schemas.microsoft.com/office/drawing/2015/9/8/chartex" xmlns:cx2="http://schemas.microsoft.com/office/drawing/2015/10/21/chartex" xmlns:cx3="http://schemas.microsoft.com/office/drawing/2016/5/9/chartex" xmlns:cx4="http://schemas.microsoft.com/office/drawing/2016/5/10/chartex" xmlns:cx5="http://schemas.microsoft.com/office/drawing/2016/5/11/chartex" xmlns:cx6="http://schemas.microsoft.com/office/drawing/2016/5/12/chartex" xmlns:cx7="http://schemas.microsoft.com/office/drawing/2016/5/13/chartex" xmlns:cx8="http://schemas.microsoft.com/office/drawing/2016/5/14/chartex" xmlns:mc="http://schemas.openxmlformats.org/markup-compatibility/2006" xmlns:aink="http://schemas.microsoft.com/office/drawing/2016/ink" xmlns:am3d="http://schemas.microsoft.com/office/drawing/2017/model3d" xmlns:o="urn:schemas-microsoft-com:office:office" xmlns:oel="http://schemas.microsoft.com/office/2019/extlst" xmlns:r="http://schemas.openxmlformats.org/officeDocument/2006/relationships" xmlns:m="http://schemas.openxmlformats.org/officeDocument/2006/math" xmlns:v="urn:schemas-microsoft-com:vml" xmlns:wp14="http://schemas.microsoft.com/office/word/2010/wordprocessingDrawing" xmlns:wp="http://schemas.openxmlformats.org/drawingml/2006/wordprocessingDrawing" xmlns:w10="urn:schemas-microsoft-com:office:word" xmlns:w="http://schemas.openxmlformats.org/wordprocessingml/2006/main" xmlns:w14="http://schemas.microsoft.com/office/word/2010/wordml" xmlns:w15="http://schemas.microsoft.com/office/word/2012/wordml" xmlns:w16cex="http://schemas.microsoft.com/office/word/2018/wordml/cex" xmlns:w16cid="http://schemas.microsoft.com/office/word/2016/wordml/cid" xmlns:w16="http://schemas.microsoft.com/office/word/2018/wordml" xmlns:w16du="http://schemas.microsoft.com/office/word/2023/wordml/word16du" xmlns:w16sdtdh="http://schemas.microsoft.com/office/word/2020/wordml/sdtdatahash" xmlns:w16sdtfl="http://schemas.microsoft.com/office/word/2024/wordml/sdtformatlock" xmlns:w16se="http://schemas.microsoft.com/office/word/2015/wordml/symex" xmlns:wpg="http://schemas.microsoft.com/office/word/2010/wordprocessingGroup" xmlns:wpi="http://schemas.microsoft.com/office/word/2010/wordprocessingInk" xmlns:wne="http://schemas.microsoft.com/office/word/2006/wordml" xmlns:wps="http://schemas.microsoft.com/office/word/2010/wordprocessingShape" mc:Ignorable="w14 w15 w16se w16cid w16 w16cex w16sdtdh w16sdtfl w16du wp14">
+<w:document xmlns:wpc="http://schemas.microsoft.com/office/word/2010/wordprocessingCanvas" xmlns:cx="http://schemas.microsoft.com/office/drawing/2014/chartex" xmlns:cx1="http://schemas.microsoft.com/office/drawing/2015/9/8/chartex" xmlns:cx2="http://schemas.microsoft.com/office/drawing/2015/10/21/chartex" xmlns:cx3="http://schemas.microsoft.com/office/drawing/2016/5/9/chartex" xmlns:cx4="http://schemas.microsoft.com/office/drawing/2016/5/10/chartex" xmlns:cx5="http://schemas.microsoft.com/office/drawing/2016/5/11/chartex" xmlns:cx6="http://schemas.microsoft.com/office/drawing/2016/5/12/chartex" xmlns:cx7="http://schemas.microsoft.com/office/drawing/2016/5/13/chartex" xmlns:cx8="http://schemas.microsoft.com/office/drawing/2016/5/14/chartex" xmlns:mc="http://schemas.openxmlformats.org/markup-compatibility/2006" xmlns:m="http://schemas.openxmlformats.org/officeDocument/2006/math" xmlns:aink="http://schemas.microsoft.com/office/drawing/2016/ink" xmlns:am3d="http://schemas.microsoft.com/office/drawing/2017/model3d" xmlns:oel="http://schemas.microsoft.com/office/2019/extlst" xmlns:r="http://schemas.openxmlformats.org/officeDocument/2006/relationships" xmlns:wp14="http://schemas.microsoft.com/office/word/2010/wordprocessingDrawing" xmlns:wp="http://schemas.openxmlformats.org/drawingml/2006/wordprocessingDrawing" xmlns:wpg="http://schemas.microsoft.com/office/word/2010/wordprocessingGroup" xmlns:wpi="http://schemas.microsoft.com/office/word/2010/wordprocessingInk" xmlns:wps="http://schemas.microsoft.com/office/word/2010/wordprocessingShape" xmlns:o="urn:schemas-microsoft-com:office:office" xmlns:v="urn:schemas-microsoft-com:vml" xmlns:w10="urn:schemas-microsoft-com:office:word" xmlns:w="http://schemas.openxmlformats.org/wordprocessingml/2006/main" xmlns:w14="http://schemas.microsoft.com/office/word/2010/wordml" xmlns:w15="http://schemas.microsoft.com/office/word/2012/wordml" xmlns:w16cei="http://schemas.microsoft.com/office/word/2026/wordml/cei" xmlns:w16cex="http://schemas.microsoft.com/office/word/2018/wordml/cex" xmlns:w16cid="http://schemas.microsoft.com/office/word/2016/wordml/cid" xmlns:w16="http://schemas.microsoft.com/office/word/2018/wordml" xmlns:w16sdtdh="http://schemas.microsoft.com/office/word/2020/wordml/sdtdatahash" xmlns:w16sdtfl="http://schemas.microsoft.com/office/word/2024/wordml/sdtformatlock" xmlns:w16se="http://schemas.microsoft.com/office/word/2015/wordml/symex" xmlns:w16du="http://schemas.microsoft.com/office/word/2023/wordml/word16du" xmlns:wne="http://schemas.microsoft.com/office/word/2006/wordml" mc:Ignorable="w14 w15 w16se w16cid w16 w16cex w16sdtdh w16sdtfl w16du wp14">
   <w:body>
     <w:p>
       <w:pPr>
@@ -20,6 +20,41 @@
           <w:color w:val="000000" w:themeColor="text1"/>
           <w:lang w:val="id-ID"/>
         </w:rPr>
+        <w:drawing>
+          <wp:inline distT="0" distB="0" distL="0" distR="0" wp14:anchorId="658FE8BF" wp14:editId="360E17FC">
+            <wp:extent cx="7556500" cy="10680700"/>
+            <wp:effectExtent l="0" t="0" r="0" b="0"/>
+            <wp:docPr id="1217641341" name="Picture 3"/>
+            <wp:cNvGraphicFramePr>
+              <a:graphicFrameLocks xmlns:a="http://schemas.openxmlformats.org/drawingml/2006/main" noChangeAspect="1"/>
+            </wp:cNvGraphicFramePr>
+            <a:graphic xmlns:a="http://schemas.openxmlformats.org/drawingml/2006/main">
+              <a:graphicData uri="http://schemas.openxmlformats.org/drawingml/2006/picture">
+                <pic:pic xmlns:pic="http://schemas.openxmlformats.org/drawingml/2006/picture">
+                  <pic:nvPicPr>
+                    <pic:cNvPr id="1217641341" name="Picture 1217641341"/>
+                    <pic:cNvPicPr/>
+                  </pic:nvPicPr>
+                  <pic:blipFill>
+                    <a:blip r:embed="rId8"/>
+                    <a:stretch>
+                      <a:fillRect/>
+                    </a:stretch>
+                  </pic:blipFill>
+                  <pic:spPr>
+                    <a:xfrm>
+                      <a:off x="0" y="0"/>
+                      <a:ext cx="7556500" cy="10680700"/>
+                    </a:xfrm>
+                    <a:prstGeom prst="rect">
+                      <a:avLst/>
+                    </a:prstGeom>
+                  </pic:spPr>
+                </pic:pic>
+              </a:graphicData>
+            </a:graphic>
+          </wp:inline>
+        </w:drawing>
       </w:r>
     </w:p>
     <w:p>
@@ -33,7 +68,7 @@
         </w:rPr>
         <w:sectPr>
           <w:pgSz w:w="11906" w:h="16838"/>
-          <w:pgMar w:top="1008" w:right="0" w:bottom="1008" w:left="0" w:header="720" w:footer="720" w:gutter="0"/>
+          <w:pgMar w:top="0" w:right="0" w:bottom="0" w:left="0" w:header="720" w:footer="720" w:gutter="0"/>
           <w:cols w:space="720"/>
           <w:docGrid w:linePitch="360"/>
         </w:sectPr>
@@ -59,6 +94,7 @@
           <w:sz w:val="44"/>
           <w:lang w:val="id-ID"/>
         </w:rPr>
+        <w:lastRenderedPageBreak/>
         <w:t>KONTRAK PERKULIAHAN</w:t>
       </w:r>
     </w:p>
@@ -1094,6 +1130,7 @@
           <w:color w:val="000000" w:themeColor="text1"/>
           <w:lang w:val="id-ID"/>
         </w:rPr>
+        <w:br w:type="page"/>
       </w:r>
     </w:p>
     <w:p>
@@ -1114,6 +1151,7 @@
           <w:color w:val="000000" w:themeColor="text1"/>
           <w:lang w:val="id-ID"/>
         </w:rPr>
+        <w:lastRenderedPageBreak/>
         <w:t>1. Latar Belakang dan Deskripsi Mata Kuliah</w:t>
       </w:r>
     </w:p>
@@ -1294,7 +1332,7 @@
               <w:rPr>
                 <w:rFonts w:ascii="Times New Roman" w:hAnsi="Times New Roman" w:cs="Times New Roman"/>
                 <w:noProof/>
-                <w:color w:val="000000" w:themeColor="text1"/>
+                <w:color w:val="FFFFFF" w:themeColor="background1"/>
                 <w:lang w:val="id-ID"/>
               </w:rPr>
             </w:pPr>
@@ -1303,7 +1341,7 @@
                 <w:rFonts w:ascii="Times New Roman" w:hAnsi="Times New Roman" w:cs="Times New Roman"/>
                 <w:b/>
                 <w:noProof/>
-                <w:color w:val="000000" w:themeColor="text1"/>
+                <w:color w:val="FFFFFF" w:themeColor="background1"/>
                 <w:sz w:val="18"/>
                 <w:lang w:val="id-ID"/>
               </w:rPr>
@@ -1329,7 +1367,7 @@
               <w:rPr>
                 <w:rFonts w:ascii="Times New Roman" w:hAnsi="Times New Roman" w:cs="Times New Roman"/>
                 <w:noProof/>
-                <w:color w:val="000000" w:themeColor="text1"/>
+                <w:color w:val="FFFFFF" w:themeColor="background1"/>
                 <w:lang w:val="id-ID"/>
               </w:rPr>
             </w:pPr>
@@ -1338,7 +1376,7 @@
                 <w:rFonts w:ascii="Times New Roman" w:hAnsi="Times New Roman" w:cs="Times New Roman"/>
                 <w:b/>
                 <w:noProof/>
-                <w:color w:val="000000" w:themeColor="text1"/>
+                <w:color w:val="FFFFFF" w:themeColor="background1"/>
                 <w:sz w:val="18"/>
                 <w:lang w:val="id-ID"/>
               </w:rPr>
@@ -1752,7 +1790,7 @@
               <w:rPr>
                 <w:rFonts w:ascii="Times New Roman" w:hAnsi="Times New Roman" w:cs="Times New Roman"/>
                 <w:noProof/>
-                <w:color w:val="000000" w:themeColor="text1"/>
+                <w:color w:val="FFFFFF" w:themeColor="background1"/>
                 <w:lang w:val="id-ID"/>
               </w:rPr>
             </w:pPr>
@@ -1761,7 +1799,7 @@
                 <w:rFonts w:ascii="Times New Roman" w:hAnsi="Times New Roman" w:cs="Times New Roman"/>
                 <w:b/>
                 <w:noProof/>
-                <w:color w:val="000000" w:themeColor="text1"/>
+                <w:color w:val="FFFFFF" w:themeColor="background1"/>
                 <w:sz w:val="16"/>
                 <w:lang w:val="id-ID"/>
               </w:rPr>
@@ -1787,7 +1825,7 @@
               <w:rPr>
                 <w:rFonts w:ascii="Times New Roman" w:hAnsi="Times New Roman" w:cs="Times New Roman"/>
                 <w:noProof/>
-                <w:color w:val="000000" w:themeColor="text1"/>
+                <w:color w:val="FFFFFF" w:themeColor="background1"/>
                 <w:lang w:val="id-ID"/>
               </w:rPr>
             </w:pPr>
@@ -1796,7 +1834,7 @@
                 <w:rFonts w:ascii="Times New Roman" w:hAnsi="Times New Roman" w:cs="Times New Roman"/>
                 <w:b/>
                 <w:noProof/>
-                <w:color w:val="000000" w:themeColor="text1"/>
+                <w:color w:val="FFFFFF" w:themeColor="background1"/>
                 <w:sz w:val="16"/>
                 <w:lang w:val="id-ID"/>
               </w:rPr>
@@ -1822,7 +1860,7 @@
               <w:rPr>
                 <w:rFonts w:ascii="Times New Roman" w:hAnsi="Times New Roman" w:cs="Times New Roman"/>
                 <w:noProof/>
-                <w:color w:val="000000" w:themeColor="text1"/>
+                <w:color w:val="FFFFFF" w:themeColor="background1"/>
                 <w:lang w:val="id-ID"/>
               </w:rPr>
             </w:pPr>
@@ -1831,7 +1869,7 @@
                 <w:rFonts w:ascii="Times New Roman" w:hAnsi="Times New Roman" w:cs="Times New Roman"/>
                 <w:b/>
                 <w:noProof/>
-                <w:color w:val="000000" w:themeColor="text1"/>
+                <w:color w:val="FFFFFF" w:themeColor="background1"/>
                 <w:sz w:val="16"/>
                 <w:lang w:val="id-ID"/>
               </w:rPr>
@@ -2265,6 +2303,7 @@
           <w:color w:val="000000" w:themeColor="text1"/>
           <w:lang w:val="id-ID"/>
         </w:rPr>
+        <w:br w:type="page"/>
       </w:r>
     </w:p>
     <w:tbl>
@@ -2436,7 +2475,7 @@
               <w:rPr>
                 <w:rFonts w:ascii="Times New Roman" w:hAnsi="Times New Roman" w:cs="Times New Roman"/>
                 <w:noProof/>
-                <w:color w:val="000000" w:themeColor="text1"/>
+                <w:color w:val="FFFFFF" w:themeColor="background1"/>
                 <w:lang w:val="id-ID"/>
               </w:rPr>
             </w:pPr>
@@ -2445,7 +2484,7 @@
                 <w:rFonts w:ascii="Times New Roman" w:hAnsi="Times New Roman" w:cs="Times New Roman"/>
                 <w:b/>
                 <w:noProof/>
-                <w:color w:val="000000" w:themeColor="text1"/>
+                <w:color w:val="FFFFFF" w:themeColor="background1"/>
                 <w:sz w:val="17"/>
                 <w:lang w:val="id-ID"/>
               </w:rPr>
@@ -2471,7 +2510,7 @@
               <w:rPr>
                 <w:rFonts w:ascii="Times New Roman" w:hAnsi="Times New Roman" w:cs="Times New Roman"/>
                 <w:noProof/>
-                <w:color w:val="000000" w:themeColor="text1"/>
+                <w:color w:val="FFFFFF" w:themeColor="background1"/>
                 <w:lang w:val="id-ID"/>
               </w:rPr>
             </w:pPr>
@@ -2480,7 +2519,7 @@
                 <w:rFonts w:ascii="Times New Roman" w:hAnsi="Times New Roman" w:cs="Times New Roman"/>
                 <w:b/>
                 <w:noProof/>
-                <w:color w:val="000000" w:themeColor="text1"/>
+                <w:color w:val="FFFFFF" w:themeColor="background1"/>
                 <w:sz w:val="17"/>
                 <w:lang w:val="id-ID"/>
               </w:rPr>
@@ -2506,7 +2545,7 @@
               <w:rPr>
                 <w:rFonts w:ascii="Times New Roman" w:hAnsi="Times New Roman" w:cs="Times New Roman"/>
                 <w:noProof/>
-                <w:color w:val="000000" w:themeColor="text1"/>
+                <w:color w:val="FFFFFF" w:themeColor="background1"/>
                 <w:lang w:val="id-ID"/>
               </w:rPr>
             </w:pPr>
@@ -2515,7 +2554,7 @@
                 <w:rFonts w:ascii="Times New Roman" w:hAnsi="Times New Roman" w:cs="Times New Roman"/>
                 <w:b/>
                 <w:noProof/>
-                <w:color w:val="000000" w:themeColor="text1"/>
+                <w:color w:val="FFFFFF" w:themeColor="background1"/>
                 <w:sz w:val="17"/>
                 <w:lang w:val="id-ID"/>
               </w:rPr>
@@ -3455,7 +3494,7 @@
           <w:headerReference w:type="default" r:id="rId9"/>
           <w:footerReference w:type="default" r:id="rId10"/>
           <w:pgSz w:w="11906" w:h="16838"/>
-          <w:pgMar w:top="1008" w:right="1021" w:bottom="1008" w:left="1021" w:header="567" w:footer="720" w:gutter="0"/>
+          <w:pgMar w:top="1134" w:right="1021" w:bottom="1179" w:left="1021" w:header="567" w:footer="720" w:gutter="0"/>
           <w:pgNumType w:start="1"/>
           <w:cols w:space="720"/>
           <w:docGrid w:linePitch="360"/>
@@ -3480,6 +3519,7 @@
           <w:color w:val="000000" w:themeColor="text1"/>
           <w:lang w:val="id-ID"/>
         </w:rPr>
+        <w:lastRenderedPageBreak/>
         <w:t>5. Rencana Pembelajaran Mingguan</w:t>
       </w:r>
     </w:p>
@@ -3540,7 +3580,7 @@
               <w:rPr>
                 <w:rFonts w:ascii="Times New Roman" w:hAnsi="Times New Roman" w:cs="Times New Roman"/>
                 <w:noProof/>
-                <w:color w:val="000000" w:themeColor="text1"/>
+                <w:color w:val="FFFFFF" w:themeColor="background1"/>
                 <w:lang w:val="id-ID"/>
               </w:rPr>
             </w:pPr>
@@ -3549,7 +3589,7 @@
                 <w:rFonts w:ascii="Times New Roman" w:hAnsi="Times New Roman" w:cs="Times New Roman"/>
                 <w:b/>
                 <w:noProof/>
-                <w:color w:val="000000" w:themeColor="text1"/>
+                <w:color w:val="FFFFFF" w:themeColor="background1"/>
                 <w:sz w:val="14"/>
                 <w:lang w:val="id-ID"/>
               </w:rPr>
@@ -3575,7 +3615,7 @@
               <w:rPr>
                 <w:rFonts w:ascii="Times New Roman" w:hAnsi="Times New Roman" w:cs="Times New Roman"/>
                 <w:noProof/>
-                <w:color w:val="000000" w:themeColor="text1"/>
+                <w:color w:val="FFFFFF" w:themeColor="background1"/>
                 <w:lang w:val="id-ID"/>
               </w:rPr>
             </w:pPr>
@@ -3584,7 +3624,7 @@
                 <w:rFonts w:ascii="Times New Roman" w:hAnsi="Times New Roman" w:cs="Times New Roman"/>
                 <w:b/>
                 <w:noProof/>
-                <w:color w:val="000000" w:themeColor="text1"/>
+                <w:color w:val="FFFFFF" w:themeColor="background1"/>
                 <w:sz w:val="14"/>
                 <w:lang w:val="id-ID"/>
               </w:rPr>
@@ -3610,7 +3650,7 @@
               <w:rPr>
                 <w:rFonts w:ascii="Times New Roman" w:hAnsi="Times New Roman" w:cs="Times New Roman"/>
                 <w:noProof/>
-                <w:color w:val="000000" w:themeColor="text1"/>
+                <w:color w:val="FFFFFF" w:themeColor="background1"/>
                 <w:lang w:val="id-ID"/>
               </w:rPr>
             </w:pPr>
@@ -3619,7 +3659,7 @@
                 <w:rFonts w:ascii="Times New Roman" w:hAnsi="Times New Roman" w:cs="Times New Roman"/>
                 <w:b/>
                 <w:noProof/>
-                <w:color w:val="000000" w:themeColor="text1"/>
+                <w:color w:val="FFFFFF" w:themeColor="background1"/>
                 <w:sz w:val="14"/>
                 <w:lang w:val="id-ID"/>
               </w:rPr>
@@ -3645,7 +3685,7 @@
               <w:rPr>
                 <w:rFonts w:ascii="Times New Roman" w:hAnsi="Times New Roman" w:cs="Times New Roman"/>
                 <w:noProof/>
-                <w:color w:val="000000" w:themeColor="text1"/>
+                <w:color w:val="FFFFFF" w:themeColor="background1"/>
                 <w:lang w:val="id-ID"/>
               </w:rPr>
             </w:pPr>
@@ -3654,7 +3694,7 @@
                 <w:rFonts w:ascii="Times New Roman" w:hAnsi="Times New Roman" w:cs="Times New Roman"/>
                 <w:b/>
                 <w:noProof/>
-                <w:color w:val="000000" w:themeColor="text1"/>
+                <w:color w:val="FFFFFF" w:themeColor="background1"/>
                 <w:sz w:val="14"/>
                 <w:lang w:val="id-ID"/>
               </w:rPr>
@@ -3680,7 +3720,7 @@
               <w:rPr>
                 <w:rFonts w:ascii="Times New Roman" w:hAnsi="Times New Roman" w:cs="Times New Roman"/>
                 <w:noProof/>
-                <w:color w:val="000000" w:themeColor="text1"/>
+                <w:color w:val="FFFFFF" w:themeColor="background1"/>
                 <w:lang w:val="id-ID"/>
               </w:rPr>
             </w:pPr>
@@ -3689,7 +3729,7 @@
                 <w:rFonts w:ascii="Times New Roman" w:hAnsi="Times New Roman" w:cs="Times New Roman"/>
                 <w:b/>
                 <w:noProof/>
-                <w:color w:val="000000" w:themeColor="text1"/>
+                <w:color w:val="FFFFFF" w:themeColor="background1"/>
                 <w:sz w:val="14"/>
                 <w:lang w:val="id-ID"/>
               </w:rPr>
@@ -5107,7 +5147,7 @@
               <w:rPr>
                 <w:rFonts w:ascii="Times New Roman" w:hAnsi="Times New Roman" w:cs="Times New Roman"/>
                 <w:noProof/>
-                <w:color w:val="000000" w:themeColor="text1"/>
+                <w:color w:val="FFFFFF" w:themeColor="background1"/>
                 <w:lang w:val="id-ID"/>
               </w:rPr>
             </w:pPr>
@@ -5116,7 +5156,7 @@
                 <w:rFonts w:ascii="Times New Roman" w:hAnsi="Times New Roman" w:cs="Times New Roman"/>
                 <w:b/>
                 <w:noProof/>
-                <w:color w:val="000000" w:themeColor="text1"/>
+                <w:color w:val="FFFFFF" w:themeColor="background1"/>
                 <w:sz w:val="14"/>
                 <w:lang w:val="id-ID"/>
               </w:rPr>
@@ -5142,7 +5182,7 @@
               <w:rPr>
                 <w:rFonts w:ascii="Times New Roman" w:hAnsi="Times New Roman" w:cs="Times New Roman"/>
                 <w:noProof/>
-                <w:color w:val="000000" w:themeColor="text1"/>
+                <w:color w:val="FFFFFF" w:themeColor="background1"/>
                 <w:lang w:val="id-ID"/>
               </w:rPr>
             </w:pPr>
@@ -5151,7 +5191,7 @@
                 <w:rFonts w:ascii="Times New Roman" w:hAnsi="Times New Roman" w:cs="Times New Roman"/>
                 <w:b/>
                 <w:noProof/>
-                <w:color w:val="000000" w:themeColor="text1"/>
+                <w:color w:val="FFFFFF" w:themeColor="background1"/>
                 <w:sz w:val="14"/>
                 <w:lang w:val="id-ID"/>
               </w:rPr>
@@ -5177,7 +5217,7 @@
               <w:rPr>
                 <w:rFonts w:ascii="Times New Roman" w:hAnsi="Times New Roman" w:cs="Times New Roman"/>
                 <w:noProof/>
-                <w:color w:val="000000" w:themeColor="text1"/>
+                <w:color w:val="FFFFFF" w:themeColor="background1"/>
                 <w:lang w:val="id-ID"/>
               </w:rPr>
             </w:pPr>
@@ -5186,7 +5226,7 @@
                 <w:rFonts w:ascii="Times New Roman" w:hAnsi="Times New Roman" w:cs="Times New Roman"/>
                 <w:b/>
                 <w:noProof/>
-                <w:color w:val="000000" w:themeColor="text1"/>
+                <w:color w:val="FFFFFF" w:themeColor="background1"/>
                 <w:sz w:val="14"/>
                 <w:lang w:val="id-ID"/>
               </w:rPr>
@@ -5212,7 +5252,7 @@
               <w:rPr>
                 <w:rFonts w:ascii="Times New Roman" w:hAnsi="Times New Roman" w:cs="Times New Roman"/>
                 <w:noProof/>
-                <w:color w:val="000000" w:themeColor="text1"/>
+                <w:color w:val="FFFFFF" w:themeColor="background1"/>
                 <w:lang w:val="id-ID"/>
               </w:rPr>
             </w:pPr>
@@ -5221,7 +5261,7 @@
                 <w:rFonts w:ascii="Times New Roman" w:hAnsi="Times New Roman" w:cs="Times New Roman"/>
                 <w:b/>
                 <w:noProof/>
-                <w:color w:val="000000" w:themeColor="text1"/>
+                <w:color w:val="FFFFFF" w:themeColor="background1"/>
                 <w:sz w:val="14"/>
                 <w:lang w:val="id-ID"/>
               </w:rPr>
@@ -5247,7 +5287,7 @@
               <w:rPr>
                 <w:rFonts w:ascii="Times New Roman" w:hAnsi="Times New Roman" w:cs="Times New Roman"/>
                 <w:noProof/>
-                <w:color w:val="000000" w:themeColor="text1"/>
+                <w:color w:val="FFFFFF" w:themeColor="background1"/>
                 <w:lang w:val="id-ID"/>
               </w:rPr>
             </w:pPr>
@@ -5256,7 +5296,7 @@
                 <w:rFonts w:ascii="Times New Roman" w:hAnsi="Times New Roman" w:cs="Times New Roman"/>
                 <w:b/>
                 <w:noProof/>
-                <w:color w:val="000000" w:themeColor="text1"/>
+                <w:color w:val="FFFFFF" w:themeColor="background1"/>
                 <w:sz w:val="14"/>
                 <w:lang w:val="id-ID"/>
               </w:rPr>
@@ -6619,7 +6659,7 @@
           <w:headerReference w:type="default" r:id="rId11"/>
           <w:footerReference w:type="default" r:id="rId12"/>
           <w:pgSz w:w="16838" w:h="11906" w:orient="landscape"/>
-          <w:pgMar w:top="1008" w:right="709" w:bottom="1008" w:left="709" w:header="720" w:footer="720" w:gutter="0"/>
+          <w:pgMar w:top="737" w:right="709" w:bottom="680" w:left="709" w:header="720" w:footer="720" w:gutter="0"/>
           <w:cols w:space="720"/>
           <w:docGrid w:linePitch="360"/>
         </w:sectPr>
@@ -6643,6 +6683,7 @@
           <w:color w:val="000000" w:themeColor="text1"/>
           <w:lang w:val="id-ID"/>
         </w:rPr>
+        <w:lastRenderedPageBreak/>
         <w:t>6. Sistem Penilaian</w:t>
       </w:r>
     </w:p>
@@ -6702,7 +6743,7 @@
               <w:rPr>
                 <w:rFonts w:ascii="Times New Roman" w:hAnsi="Times New Roman" w:cs="Times New Roman"/>
                 <w:noProof/>
-                <w:color w:val="000000" w:themeColor="text1"/>
+                <w:color w:val="FFFFFF" w:themeColor="background1"/>
                 <w:lang w:val="id-ID"/>
               </w:rPr>
             </w:pPr>
@@ -6711,7 +6752,7 @@
                 <w:rFonts w:ascii="Times New Roman" w:hAnsi="Times New Roman" w:cs="Times New Roman"/>
                 <w:b/>
                 <w:noProof/>
-                <w:color w:val="000000" w:themeColor="text1"/>
+                <w:color w:val="FFFFFF" w:themeColor="background1"/>
                 <w:sz w:val="16"/>
                 <w:lang w:val="id-ID"/>
               </w:rPr>
@@ -6737,7 +6778,7 @@
               <w:rPr>
                 <w:rFonts w:ascii="Times New Roman" w:hAnsi="Times New Roman" w:cs="Times New Roman"/>
                 <w:noProof/>
-                <w:color w:val="000000" w:themeColor="text1"/>
+                <w:color w:val="FFFFFF" w:themeColor="background1"/>
                 <w:lang w:val="id-ID"/>
               </w:rPr>
             </w:pPr>
@@ -6746,7 +6787,7 @@
                 <w:rFonts w:ascii="Times New Roman" w:hAnsi="Times New Roman" w:cs="Times New Roman"/>
                 <w:b/>
                 <w:noProof/>
-                <w:color w:val="000000" w:themeColor="text1"/>
+                <w:color w:val="FFFFFF" w:themeColor="background1"/>
                 <w:sz w:val="16"/>
                 <w:lang w:val="id-ID"/>
               </w:rPr>
@@ -6772,7 +6813,7 @@
               <w:rPr>
                 <w:rFonts w:ascii="Times New Roman" w:hAnsi="Times New Roman" w:cs="Times New Roman"/>
                 <w:noProof/>
-                <w:color w:val="000000" w:themeColor="text1"/>
+                <w:color w:val="FFFFFF" w:themeColor="background1"/>
                 <w:lang w:val="id-ID"/>
               </w:rPr>
             </w:pPr>
@@ -6781,7 +6822,7 @@
                 <w:rFonts w:ascii="Times New Roman" w:hAnsi="Times New Roman" w:cs="Times New Roman"/>
                 <w:b/>
                 <w:noProof/>
-                <w:color w:val="000000" w:themeColor="text1"/>
+                <w:color w:val="FFFFFF" w:themeColor="background1"/>
                 <w:sz w:val="16"/>
                 <w:lang w:val="id-ID"/>
               </w:rPr>
@@ -6807,7 +6848,7 @@
               <w:rPr>
                 <w:rFonts w:ascii="Times New Roman" w:hAnsi="Times New Roman" w:cs="Times New Roman"/>
                 <w:noProof/>
-                <w:color w:val="000000" w:themeColor="text1"/>
+                <w:color w:val="FFFFFF" w:themeColor="background1"/>
                 <w:lang w:val="id-ID"/>
               </w:rPr>
             </w:pPr>
@@ -6816,7 +6857,7 @@
                 <w:rFonts w:ascii="Times New Roman" w:hAnsi="Times New Roman" w:cs="Times New Roman"/>
                 <w:b/>
                 <w:noProof/>
-                <w:color w:val="000000" w:themeColor="text1"/>
+                <w:color w:val="FFFFFF" w:themeColor="background1"/>
                 <w:sz w:val="16"/>
                 <w:lang w:val="id-ID"/>
               </w:rPr>
@@ -7575,7 +7616,7 @@
               <w:rPr>
                 <w:rFonts w:ascii="Times New Roman" w:hAnsi="Times New Roman" w:cs="Times New Roman"/>
                 <w:noProof/>
-                <w:color w:val="000000" w:themeColor="text1"/>
+                <w:color w:val="FFFFFF" w:themeColor="background1"/>
                 <w:lang w:val="id-ID"/>
               </w:rPr>
             </w:pPr>
@@ -7584,7 +7625,7 @@
                 <w:rFonts w:ascii="Times New Roman" w:hAnsi="Times New Roman" w:cs="Times New Roman"/>
                 <w:b/>
                 <w:noProof/>
-                <w:color w:val="000000" w:themeColor="text1"/>
+                <w:color w:val="FFFFFF" w:themeColor="background1"/>
                 <w:sz w:val="17"/>
                 <w:lang w:val="id-ID"/>
               </w:rPr>
@@ -7610,7 +7651,7 @@
               <w:rPr>
                 <w:rFonts w:ascii="Times New Roman" w:hAnsi="Times New Roman" w:cs="Times New Roman"/>
                 <w:noProof/>
-                <w:color w:val="000000" w:themeColor="text1"/>
+                <w:color w:val="FFFFFF" w:themeColor="background1"/>
                 <w:lang w:val="id-ID"/>
               </w:rPr>
             </w:pPr>
@@ -7619,7 +7660,7 @@
                 <w:rFonts w:ascii="Times New Roman" w:hAnsi="Times New Roman" w:cs="Times New Roman"/>
                 <w:b/>
                 <w:noProof/>
-                <w:color w:val="000000" w:themeColor="text1"/>
+                <w:color w:val="FFFFFF" w:themeColor="background1"/>
                 <w:sz w:val="17"/>
                 <w:lang w:val="id-ID"/>
               </w:rPr>
@@ -7645,7 +7686,7 @@
               <w:rPr>
                 <w:rFonts w:ascii="Times New Roman" w:hAnsi="Times New Roman" w:cs="Times New Roman"/>
                 <w:noProof/>
-                <w:color w:val="000000" w:themeColor="text1"/>
+                <w:color w:val="FFFFFF" w:themeColor="background1"/>
                 <w:lang w:val="id-ID"/>
               </w:rPr>
             </w:pPr>
@@ -7654,7 +7695,7 @@
                 <w:rFonts w:ascii="Times New Roman" w:hAnsi="Times New Roman" w:cs="Times New Roman"/>
                 <w:b/>
                 <w:noProof/>
-                <w:color w:val="000000" w:themeColor="text1"/>
+                <w:color w:val="FFFFFF" w:themeColor="background1"/>
                 <w:sz w:val="17"/>
                 <w:lang w:val="id-ID"/>
               </w:rPr>
@@ -8241,7 +8282,7 @@
               <w:rPr>
                 <w:rFonts w:ascii="Times New Roman" w:hAnsi="Times New Roman" w:cs="Times New Roman"/>
                 <w:noProof/>
-                <w:color w:val="000000" w:themeColor="text1"/>
+                <w:color w:val="FFFFFF" w:themeColor="background1"/>
                 <w:lang w:val="id-ID"/>
               </w:rPr>
             </w:pPr>
@@ -8250,7 +8291,7 @@
                 <w:rFonts w:ascii="Times New Roman" w:hAnsi="Times New Roman" w:cs="Times New Roman"/>
                 <w:b/>
                 <w:noProof/>
-                <w:color w:val="000000" w:themeColor="text1"/>
+                <w:color w:val="FFFFFF" w:themeColor="background1"/>
                 <w:sz w:val="16"/>
                 <w:lang w:val="id-ID"/>
               </w:rPr>
@@ -8276,7 +8317,7 @@
               <w:rPr>
                 <w:rFonts w:ascii="Times New Roman" w:hAnsi="Times New Roman" w:cs="Times New Roman"/>
                 <w:noProof/>
-                <w:color w:val="000000" w:themeColor="text1"/>
+                <w:color w:val="FFFFFF" w:themeColor="background1"/>
                 <w:lang w:val="id-ID"/>
               </w:rPr>
             </w:pPr>
@@ -8285,7 +8326,7 @@
                 <w:rFonts w:ascii="Times New Roman" w:hAnsi="Times New Roman" w:cs="Times New Roman"/>
                 <w:b/>
                 <w:noProof/>
-                <w:color w:val="000000" w:themeColor="text1"/>
+                <w:color w:val="FFFFFF" w:themeColor="background1"/>
                 <w:sz w:val="16"/>
                 <w:lang w:val="id-ID"/>
               </w:rPr>
@@ -8311,7 +8352,7 @@
               <w:rPr>
                 <w:rFonts w:ascii="Times New Roman" w:hAnsi="Times New Roman" w:cs="Times New Roman"/>
                 <w:noProof/>
-                <w:color w:val="000000" w:themeColor="text1"/>
+                <w:color w:val="FFFFFF" w:themeColor="background1"/>
                 <w:lang w:val="id-ID"/>
               </w:rPr>
             </w:pPr>
@@ -8320,7 +8361,7 @@
                 <w:rFonts w:ascii="Times New Roman" w:hAnsi="Times New Roman" w:cs="Times New Roman"/>
                 <w:b/>
                 <w:noProof/>
-                <w:color w:val="000000" w:themeColor="text1"/>
+                <w:color w:val="FFFFFF" w:themeColor="background1"/>
                 <w:sz w:val="16"/>
                 <w:lang w:val="id-ID"/>
               </w:rPr>
@@ -9064,6 +9105,7 @@
           <w:color w:val="000000" w:themeColor="text1"/>
           <w:lang w:val="id-ID"/>
         </w:rPr>
+        <w:lastRenderedPageBreak/>
         <w:t>7. Tata Tertib Perkuliahan</w:t>
       </w:r>
     </w:p>
@@ -9421,7 +9463,7 @@
               <w:rPr>
                 <w:rFonts w:ascii="Times New Roman" w:hAnsi="Times New Roman" w:cs="Times New Roman"/>
                 <w:noProof/>
-                <w:color w:val="000000" w:themeColor="text1"/>
+                <w:color w:val="FFFFFF" w:themeColor="background1"/>
                 <w:lang w:val="id-ID"/>
               </w:rPr>
             </w:pPr>
@@ -9430,7 +9472,7 @@
                 <w:rFonts w:ascii="Times New Roman" w:hAnsi="Times New Roman" w:cs="Times New Roman"/>
                 <w:b/>
                 <w:noProof/>
-                <w:color w:val="000000" w:themeColor="text1"/>
+                <w:color w:val="FFFFFF" w:themeColor="background1"/>
                 <w:sz w:val="16"/>
                 <w:lang w:val="id-ID"/>
               </w:rPr>
@@ -9456,7 +9498,7 @@
               <w:rPr>
                 <w:rFonts w:ascii="Times New Roman" w:hAnsi="Times New Roman" w:cs="Times New Roman"/>
                 <w:noProof/>
-                <w:color w:val="000000" w:themeColor="text1"/>
+                <w:color w:val="FFFFFF" w:themeColor="background1"/>
                 <w:lang w:val="id-ID"/>
               </w:rPr>
             </w:pPr>
@@ -9465,7 +9507,7 @@
                 <w:rFonts w:ascii="Times New Roman" w:hAnsi="Times New Roman" w:cs="Times New Roman"/>
                 <w:b/>
                 <w:noProof/>
-                <w:color w:val="000000" w:themeColor="text1"/>
+                <w:color w:val="FFFFFF" w:themeColor="background1"/>
                 <w:sz w:val="16"/>
                 <w:lang w:val="id-ID"/>
               </w:rPr>
@@ -9768,7 +9810,7 @@
               <w:rPr>
                 <w:rFonts w:ascii="Times New Roman" w:hAnsi="Times New Roman" w:cs="Times New Roman"/>
                 <w:noProof/>
-                <w:color w:val="000000" w:themeColor="text1"/>
+                <w:color w:val="FFFFFF" w:themeColor="background1"/>
                 <w:lang w:val="id-ID"/>
               </w:rPr>
             </w:pPr>
@@ -9777,7 +9819,7 @@
                 <w:rFonts w:ascii="Times New Roman" w:hAnsi="Times New Roman" w:cs="Times New Roman"/>
                 <w:b/>
                 <w:noProof/>
-                <w:color w:val="000000" w:themeColor="text1"/>
+                <w:color w:val="FFFFFF" w:themeColor="background1"/>
                 <w:sz w:val="17"/>
                 <w:lang w:val="id-ID"/>
               </w:rPr>
@@ -9803,7 +9845,7 @@
               <w:rPr>
                 <w:rFonts w:ascii="Times New Roman" w:hAnsi="Times New Roman" w:cs="Times New Roman"/>
                 <w:noProof/>
-                <w:color w:val="000000" w:themeColor="text1"/>
+                <w:color w:val="FFFFFF" w:themeColor="background1"/>
                 <w:lang w:val="id-ID"/>
               </w:rPr>
             </w:pPr>
@@ -9812,7 +9854,7 @@
                 <w:rFonts w:ascii="Times New Roman" w:hAnsi="Times New Roman" w:cs="Times New Roman"/>
                 <w:b/>
                 <w:noProof/>
-                <w:color w:val="000000" w:themeColor="text1"/>
+                <w:color w:val="FFFFFF" w:themeColor="background1"/>
                 <w:sz w:val="17"/>
                 <w:lang w:val="id-ID"/>
               </w:rPr>
@@ -10049,6 +10091,7 @@
           <w:color w:val="000000" w:themeColor="text1"/>
           <w:lang w:val="id-ID"/>
         </w:rPr>
+        <w:lastRenderedPageBreak/>
         <w:t>8.1 Lembar Persetujuan</w:t>
       </w:r>
     </w:p>
@@ -10722,7 +10765,7 @@
               <w:rPr>
                 <w:rFonts w:ascii="Times New Roman" w:hAnsi="Times New Roman" w:cs="Times New Roman"/>
                 <w:noProof/>
-                <w:color w:val="000000" w:themeColor="text1"/>
+                <w:color w:val="FFFFFF" w:themeColor="background1"/>
                 <w:lang w:val="id-ID"/>
               </w:rPr>
             </w:pPr>
@@ -10731,7 +10774,7 @@
                 <w:rFonts w:ascii="Times New Roman" w:hAnsi="Times New Roman" w:cs="Times New Roman"/>
                 <w:b/>
                 <w:noProof/>
-                <w:color w:val="000000" w:themeColor="text1"/>
+                <w:color w:val="FFFFFF" w:themeColor="background1"/>
                 <w:sz w:val="17"/>
                 <w:lang w:val="id-ID"/>
               </w:rPr>
@@ -10757,7 +10800,7 @@
               <w:rPr>
                 <w:rFonts w:ascii="Times New Roman" w:hAnsi="Times New Roman" w:cs="Times New Roman"/>
                 <w:noProof/>
-                <w:color w:val="000000" w:themeColor="text1"/>
+                <w:color w:val="FFFFFF" w:themeColor="background1"/>
                 <w:lang w:val="id-ID"/>
               </w:rPr>
             </w:pPr>
@@ -10766,7 +10809,7 @@
                 <w:rFonts w:ascii="Times New Roman" w:hAnsi="Times New Roman" w:cs="Times New Roman"/>
                 <w:b/>
                 <w:noProof/>
-                <w:color w:val="000000" w:themeColor="text1"/>
+                <w:color w:val="FFFFFF" w:themeColor="background1"/>
                 <w:sz w:val="17"/>
                 <w:lang w:val="id-ID"/>
               </w:rPr>
@@ -11476,6 +11519,7 @@
           <w:sz w:val="18"/>
           <w:lang w:val="id-ID"/>
         </w:rPr>
+        <w:lastRenderedPageBreak/>
         <w:t>Breiman, L. (2001). Random Forests. Machine Learning, 45, 5–32.</w:t>
       </w:r>
     </w:p>
@@ -11631,237 +11675,20 @@
         </w:rPr>
       </w:pPr>
     </w:p>
-    <w:p>
-      <w:r/>
-    </w:p>
-    <w:p>
-      <w:r/>
-    </w:p>
-    <w:p>
-      <w:r/>
-    </w:p>
-    <w:p>
-      <w:r/>
-    </w:p>
-    <w:p>
-      <w:r/>
-    </w:p>
-    <w:p>
-      <w:r/>
-    </w:p>
-    <w:p>
-      <w:r>
-        <w:br w:type="page"/>
-      </w:r>
-    </w:p>
-    <w:p>
-      <w:pPr>
-        <w:pStyle w:val="Heading1"/>
-      </w:pPr>
-      <w:r>
-        <w:rPr>
-          <w:b/>
-          <w:color w:val="17395C"/>
-          <w:sz w:val="32"/>
-        </w:rPr>
-        <w:t>PENYELARASAN KONTRAK DENGAN RPS REVISI AI 2026</w:t>
-      </w:r>
-    </w:p>
-    <w:p>
-      <w:r>
-        <w:t>Kontrak perkuliahan Analisis Deret Waktu Tingkat Lanjut ini mengikuti RPS Revisi AI 2026. Rumusan CPL tidak diubah. AI berfungsi sebagai alat bantu untuk mempercepat ketercapaian CPMK/Sub-CPMK, bukan pengganti penalaran statistika, keputusan metodologis, atau tanggung jawab akademik.</w:t>
-      </w:r>
-    </w:p>
-    <w:p>
-      <w:pPr>
-        <w:pStyle w:val="Heading2"/>
-      </w:pPr>
-      <w:r>
-        <w:t>CPMK yang dipercepat melalui dukungan AI</w:t>
-      </w:r>
-    </w:p>
-    <w:p>
-      <w:pPr>
-        <w:pStyle w:val="ListBullet"/>
-      </w:pPr>
-      <w:r>
-        <w:t>CPMK1: Mampu menganalisis karakteristik data, asumsi, dan permasalahan yang relevan dengan Analisis Deret Waktu Tingkat Lanjut.</w:t>
-      </w:r>
-    </w:p>
-    <w:p>
-      <w:pPr>
-        <w:pStyle w:val="ListBullet"/>
-      </w:pPr>
-      <w:r>
-        <w:t>CPMK2: Mampu mengevaluasi dan memilih metode Analisis Deret Waktu Tingkat Lanjut yang tepat sesuai tujuan, desain data, dan konteks penerapan.</w:t>
-      </w:r>
-    </w:p>
-    <w:p>
-      <w:pPr>
-        <w:pStyle w:val="ListBullet"/>
-      </w:pPr>
-      <w:r>
-        <w:t>CPMK3: Mampu mengimplementasikan, mendiagnosis, dan memvalidasi analisis Analisis Deret Waktu Tingkat Lanjut menggunakan perangkat lunak statistika.</w:t>
-      </w:r>
-    </w:p>
-    <w:p>
-      <w:pPr>
-        <w:pStyle w:val="ListBullet"/>
-      </w:pPr>
-      <w:r>
-        <w:t>CPMK4: Mampu menyintesis proyek/riset Analisis Deret Waktu Tingkat Lanjut secara mandiri serta mengomunikasikan hasil, ketidakpastian, dan keterbatasannya.</w:t>
-      </w:r>
-    </w:p>
-    <w:p>
-      <w:pPr>
-        <w:pStyle w:val="Heading2"/>
-      </w:pPr>
-      <w:r>
-        <w:t>Integrasi AI kontekstual</w:t>
-      </w:r>
-    </w:p>
-    <w:p>
-      <w:pPr>
-        <w:pStyle w:val="ListBullet"/>
-      </w:pPr>
-      <w:r>
-        <w:t>Perbandingan ARIMA/ARFIMA/VAR/GSTAR dengan gradient boosting, recurrent neural network, transformer, dan model hibrida untuk deret waktu.</w:t>
-      </w:r>
-    </w:p>
-    <w:p>
-      <w:pPr>
-        <w:pStyle w:val="ListBullet"/>
-      </w:pPr>
-      <w:r>
-        <w:t>Rolling-origin evaluation, probabilistic forecasting, interval prediction, calibration, deteksi concept drift, dan interpretabilitas temporal.</w:t>
-      </w:r>
-    </w:p>
-    <w:p>
-      <w:pPr>
-        <w:pStyle w:val="ListBullet"/>
-      </w:pPr>
-      <w:r>
-        <w:t>Proyek peramalan data nyata yang menilai bukan hanya akurasi, tetapi juga stabilitas, ketidakpastian, biaya kesalahan, dan relevansi keputusan.</w:t>
-      </w:r>
-    </w:p>
-    <w:p>
-      <w:pPr>
-        <w:pStyle w:val="Heading2"/>
-      </w:pPr>
-      <w:r>
-        <w:t>Aturan penggunaan dan bukti yang wajib diserahkan</w:t>
-      </w:r>
-    </w:p>
-    <w:p>
-      <w:pPr>
-        <w:pStyle w:val="ListNumber"/>
-      </w:pPr>
-      <w:r>
-        <w:t>AI boleh digunakan untuk eksplorasi, penyusunan alternatif, pemeriksaan kode, simulasi, atau umpan balik awal sesuai instruksi dosen.</w:t>
-      </w:r>
-    </w:p>
-    <w:p>
-      <w:pPr>
-        <w:pStyle w:val="ListNumber"/>
-      </w:pPr>
-      <w:r>
-        <w:t>Setiap penggunaan AI wajib disertai pernyataan penggunaan, prompt log ringkas, sumber, versi alat, perubahan yang dilakukan, dan bukti verifikasi mandiri.</w:t>
-      </w:r>
-    </w:p>
-    <w:p>
-      <w:pPr>
-        <w:pStyle w:val="ListNumber"/>
-      </w:pPr>
-      <w:r>
-        <w:t>Keluaran wajib diperiksa terhadap asumsi metode, sumber primer, hasil numerik, diagnostik, ketidakpastian, robustness, bias/fairness, privasi, dan konteks.</w:t>
-      </w:r>
-    </w:p>
-    <w:p>
-      <w:pPr>
-        <w:pStyle w:val="ListNumber"/>
-      </w:pPr>
-      <w:r>
-        <w:t>Data pribadi, rahasia, soal asesmen tertutup, materi berhak cipta tanpa izin, dan kredensial tidak boleh dimasukkan ke layanan AI yang tidak disetujui.</w:t>
-      </w:r>
-    </w:p>
-    <w:p>
-      <w:pPr>
-        <w:pStyle w:val="ListNumber"/>
-      </w:pPr>
-      <w:r>
-        <w:t>Pada asesmen yang dinyatakan tanpa AI, mahasiswa wajib menaati pembatasan tersebut. Mahasiswa selalu wajib mampu menjelaskan seluruh hasil secara mandiri.</w:t>
-      </w:r>
-    </w:p>
-    <w:p>
-      <w:pPr>
-        <w:pStyle w:val="Heading2"/>
-      </w:pPr>
-      <w:r>
-        <w:t>Rubrik minimum asesmen berbantuan AI</w:t>
-      </w:r>
-    </w:p>
-    <w:p>
-      <w:pPr>
-        <w:pStyle w:val="ListBullet"/>
-      </w:pPr>
-      <w:r>
-        <w:rPr>
-          <w:b/>
-        </w:rPr>
-        <w:t xml:space="preserve">Ketepatan metodologi (35%) — </w:t>
-      </w:r>
-      <w:r>
-        <w:t>Asumsi, metode, derivasi/kode, dan inferensi benar serta sesuai konteks.</w:t>
-      </w:r>
-    </w:p>
-    <w:p>
-      <w:pPr>
-        <w:pStyle w:val="ListBullet"/>
-      </w:pPr>
-      <w:r>
-        <w:rPr>
-          <w:b/>
-        </w:rPr>
-        <w:t xml:space="preserve">Validasi dan ketidakpastian (25%) — </w:t>
-      </w:r>
-      <w:r>
-        <w:t>Hasil diuji ulang; diagnostik, robustness, ketidakpastian, dan keterbatasan dibahas.</w:t>
-      </w:r>
-    </w:p>
-    <w:p>
-      <w:pPr>
-        <w:pStyle w:val="ListBullet"/>
-      </w:pPr>
-      <w:r>
-        <w:rPr>
-          <w:b/>
-        </w:rPr>
-        <w:t xml:space="preserve">Reproducibility dan audit trail (20%) — </w:t>
-      </w:r>
-      <w:r>
-        <w:t>Data dictionary, kode/notebook, versi alat, prompt log, sumber, dan jejak agen memadai.</w:t>
-      </w:r>
-    </w:p>
-    <w:p>
-      <w:pPr>
-        <w:pStyle w:val="ListBullet"/>
-      </w:pPr>
-      <w:r>
-        <w:rPr>
-          <w:b/>
-        </w:rPr>
-        <w:t xml:space="preserve">Responsible AI dan komunikasi (20%) — </w:t>
-      </w:r>
-      <w:r>
-        <w:t>Privasi, fairness, transparansi, human oversight, dampak, dan komunikasi dipenuhi.</w:t>
-      </w:r>
-    </w:p>
+    <w:sectPr>
+      <w:headerReference w:type="default" r:id="rId13"/>
+      <w:footerReference w:type="default" r:id="rId14"/>
+      <w:pgSz w:w="11906" w:h="16838"/>
+      <w:pgMar w:top="964" w:right="1020" w:bottom="850" w:left="1020" w:header="720" w:footer="720" w:gutter="0"/>
+      <w:cols w:space="720"/>
+      <w:docGrid w:linePitch="360"/>
+    </w:sectPr>
   </w:body>
 </w:document>
 </file>
 
 <file path=word/endnotes.xml><?xml version="1.0" encoding="utf-8"?>
-<w:endnotes xmlns:wpc="http://schemas.microsoft.com/office/word/2010/wordprocessingCanvas" xmlns:cx="http://schemas.microsoft.com/office/drawing/2014/chartex" xmlns:cx1="http://schemas.microsoft.com/office/drawing/2015/9/8/chartex" xmlns:cx2="http://schemas.microsoft.com/office/drawing/2015/10/21/chartex" xmlns:cx3="http://schemas.microsoft.com/office/drawing/2016/5/9/chartex" xmlns:cx4="http://schemas.microsoft.com/office/drawing/2016/5/10/chartex" xmlns:cx5="http://schemas.microsoft.com/office/drawing/2016/5/11/chartex" xmlns:cx6="http://schemas.microsoft.com/office/drawing/2016/5/12/chartex" xmlns:cx7="http://schemas.microsoft.com/office/drawing/2016/5/13/chartex" xmlns:cx8="http://schemas.microsoft.com/office/drawing/2016/5/14/chartex" xmlns:mc="http://schemas.openxmlformats.org/markup-compatibility/2006" xmlns:aink="http://schemas.microsoft.com/office/drawing/2016/ink" xmlns:am3d="http://schemas.microsoft.com/office/drawing/2017/model3d" xmlns:o="urn:schemas-microsoft-com:office:office" xmlns:oel="http://schemas.microsoft.com/office/2019/extlst" xmlns:r="http://schemas.openxmlformats.org/officeDocument/2006/relationships" xmlns:m="http://schemas.openxmlformats.org/officeDocument/2006/math" xmlns:v="urn:schemas-microsoft-com:vml" xmlns:wp14="http://schemas.microsoft.com/office/word/2010/wordprocessingDrawing" xmlns:wp="http://schemas.openxmlformats.org/drawingml/2006/wordprocessingDrawing" xmlns:w10="urn:schemas-microsoft-com:office:word" xmlns:w="http://schemas.openxmlformats.org/wordprocessingml/2006/main" xmlns:w14="http://schemas.microsoft.com/office/word/2010/wordml" xmlns:w15="http://schemas.microsoft.com/office/word/2012/wordml" xmlns:w16cex="http://schemas.microsoft.com/office/word/2018/wordml/cex" xmlns:w16cid="http://schemas.microsoft.com/office/word/2016/wordml/cid" xmlns:w16="http://schemas.microsoft.com/office/word/2018/wordml" xmlns:w16du="http://schemas.microsoft.com/office/word/2023/wordml/word16du" xmlns:w16sdtdh="http://schemas.microsoft.com/office/word/2020/wordml/sdtdatahash" xmlns:w16sdtfl="http://schemas.microsoft.com/office/word/2024/wordml/sdtformatlock" xmlns:w16se="http://schemas.microsoft.com/office/word/2015/wordml/symex" xmlns:wpg="http://schemas.microsoft.com/office/word/2010/wordprocessingGroup" xmlns:wpi="http://schemas.microsoft.com/office/word/2010/wordprocessingInk" xmlns:wne="http://schemas.microsoft.com/office/word/2006/wordml" xmlns:wps="http://schemas.microsoft.com/office/word/2010/wordprocessingShape" mc:Ignorable="w14 w15 w16se w16cid w16 w16cex w16sdtdh w16sdtfl w16du wp14">
+<w:endnotes xmlns:wpc="http://schemas.microsoft.com/office/word/2010/wordprocessingCanvas" xmlns:cx="http://schemas.microsoft.com/office/drawing/2014/chartex" xmlns:cx1="http://schemas.microsoft.com/office/drawing/2015/9/8/chartex" xmlns:cx2="http://schemas.microsoft.com/office/drawing/2015/10/21/chartex" xmlns:cx3="http://schemas.microsoft.com/office/drawing/2016/5/9/chartex" xmlns:cx4="http://schemas.microsoft.com/office/drawing/2016/5/10/chartex" xmlns:cx5="http://schemas.microsoft.com/office/drawing/2016/5/11/chartex" xmlns:cx6="http://schemas.microsoft.com/office/drawing/2016/5/12/chartex" xmlns:cx7="http://schemas.microsoft.com/office/drawing/2016/5/13/chartex" xmlns:cx8="http://schemas.microsoft.com/office/drawing/2016/5/14/chartex" xmlns:mc="http://schemas.openxmlformats.org/markup-compatibility/2006" xmlns:m="http://schemas.openxmlformats.org/officeDocument/2006/math" xmlns:aink="http://schemas.microsoft.com/office/drawing/2016/ink" xmlns:am3d="http://schemas.microsoft.com/office/drawing/2017/model3d" xmlns:oel="http://schemas.microsoft.com/office/2019/extlst" xmlns:r="http://schemas.openxmlformats.org/officeDocument/2006/relationships" xmlns:wp14="http://schemas.microsoft.com/office/word/2010/wordprocessingDrawing" xmlns:wp="http://schemas.openxmlformats.org/drawingml/2006/wordprocessingDrawing" xmlns:wpg="http://schemas.microsoft.com/office/word/2010/wordprocessingGroup" xmlns:wpi="http://schemas.microsoft.com/office/word/2010/wordprocessingInk" xmlns:wps="http://schemas.microsoft.com/office/word/2010/wordprocessingShape" xmlns:o="urn:schemas-microsoft-com:office:office" xmlns:v="urn:schemas-microsoft-com:vml" xmlns:w10="urn:schemas-microsoft-com:office:word" xmlns:w="http://schemas.openxmlformats.org/wordprocessingml/2006/main" xmlns:w14="http://schemas.microsoft.com/office/word/2010/wordml" xmlns:w15="http://schemas.microsoft.com/office/word/2012/wordml" xmlns:w16cei="http://schemas.microsoft.com/office/word/2026/wordml/cei" xmlns:w16cex="http://schemas.microsoft.com/office/word/2018/wordml/cex" xmlns:w16cid="http://schemas.microsoft.com/office/word/2016/wordml/cid" xmlns:w16="http://schemas.microsoft.com/office/word/2018/wordml" xmlns:w16sdtdh="http://schemas.microsoft.com/office/word/2020/wordml/sdtdatahash" xmlns:w16sdtfl="http://schemas.microsoft.com/office/word/2024/wordml/sdtformatlock" xmlns:w16se="http://schemas.microsoft.com/office/word/2015/wordml/symex" xmlns:w16du="http://schemas.microsoft.com/office/word/2023/wordml/word16du" xmlns:wne="http://schemas.microsoft.com/office/word/2006/wordml" mc:Ignorable="w14 w15 w16se w16cid w16 w16cex w16sdtdh w16sdtfl w16du wp14">
   <w:endnote w:type="separator" w:id="-1">
     <w:p>
       <w:pPr>
@@ -11886,7 +11713,7 @@
 </file>
 
 <file path=word/footer1.xml><?xml version="1.0" encoding="utf-8"?>
-<w:ftr xmlns:wpc="http://schemas.microsoft.com/office/word/2010/wordprocessingCanvas" xmlns:cx="http://schemas.microsoft.com/office/drawing/2014/chartex" xmlns:cx1="http://schemas.microsoft.com/office/drawing/2015/9/8/chartex" xmlns:cx2="http://schemas.microsoft.com/office/drawing/2015/10/21/chartex" xmlns:cx3="http://schemas.microsoft.com/office/drawing/2016/5/9/chartex" xmlns:cx4="http://schemas.microsoft.com/office/drawing/2016/5/10/chartex" xmlns:cx5="http://schemas.microsoft.com/office/drawing/2016/5/11/chartex" xmlns:cx6="http://schemas.microsoft.com/office/drawing/2016/5/12/chartex" xmlns:cx7="http://schemas.microsoft.com/office/drawing/2016/5/13/chartex" xmlns:cx8="http://schemas.microsoft.com/office/drawing/2016/5/14/chartex" xmlns:mc="http://schemas.openxmlformats.org/markup-compatibility/2006" xmlns:aink="http://schemas.microsoft.com/office/drawing/2016/ink" xmlns:am3d="http://schemas.microsoft.com/office/drawing/2017/model3d" xmlns:o="urn:schemas-microsoft-com:office:office" xmlns:oel="http://schemas.microsoft.com/office/2019/extlst" xmlns:r="http://schemas.openxmlformats.org/officeDocument/2006/relationships" xmlns:m="http://schemas.openxmlformats.org/officeDocument/2006/math" xmlns:v="urn:schemas-microsoft-com:vml" xmlns:wp14="http://schemas.microsoft.com/office/word/2010/wordprocessingDrawing" xmlns:wp="http://schemas.openxmlformats.org/drawingml/2006/wordprocessingDrawing" xmlns:w10="urn:schemas-microsoft-com:office:word" xmlns:w="http://schemas.openxmlformats.org/wordprocessingml/2006/main" xmlns:w14="http://schemas.microsoft.com/office/word/2010/wordml" xmlns:w15="http://schemas.microsoft.com/office/word/2012/wordml" xmlns:w16cex="http://schemas.microsoft.com/office/word/2018/wordml/cex" xmlns:w16cid="http://schemas.microsoft.com/office/word/2016/wordml/cid" xmlns:w16="http://schemas.microsoft.com/office/word/2018/wordml" xmlns:w16du="http://schemas.microsoft.com/office/word/2023/wordml/word16du" xmlns:w16sdtdh="http://schemas.microsoft.com/office/word/2020/wordml/sdtdatahash" xmlns:w16sdtfl="http://schemas.microsoft.com/office/word/2024/wordml/sdtformatlock" xmlns:w16se="http://schemas.microsoft.com/office/word/2015/wordml/symex" xmlns:wpg="http://schemas.microsoft.com/office/word/2010/wordprocessingGroup" xmlns:wpi="http://schemas.microsoft.com/office/word/2010/wordprocessingInk" xmlns:wne="http://schemas.microsoft.com/office/word/2006/wordml" xmlns:wps="http://schemas.microsoft.com/office/word/2010/wordprocessingShape" mc:Ignorable="w14 w15 w16se w16cid w16 w16cex w16sdtdh w16sdtfl w16du wp14">
+<w:ftr xmlns:wpc="http://schemas.microsoft.com/office/word/2010/wordprocessingCanvas" xmlns:cx="http://schemas.microsoft.com/office/drawing/2014/chartex" xmlns:cx1="http://schemas.microsoft.com/office/drawing/2015/9/8/chartex" xmlns:cx2="http://schemas.microsoft.com/office/drawing/2015/10/21/chartex" xmlns:cx3="http://schemas.microsoft.com/office/drawing/2016/5/9/chartex" xmlns:cx4="http://schemas.microsoft.com/office/drawing/2016/5/10/chartex" xmlns:cx5="http://schemas.microsoft.com/office/drawing/2016/5/11/chartex" xmlns:cx6="http://schemas.microsoft.com/office/drawing/2016/5/12/chartex" xmlns:cx7="http://schemas.microsoft.com/office/drawing/2016/5/13/chartex" xmlns:cx8="http://schemas.microsoft.com/office/drawing/2016/5/14/chartex" xmlns:mc="http://schemas.openxmlformats.org/markup-compatibility/2006" xmlns:m="http://schemas.openxmlformats.org/officeDocument/2006/math" xmlns:aink="http://schemas.microsoft.com/office/drawing/2016/ink" xmlns:am3d="http://schemas.microsoft.com/office/drawing/2017/model3d" xmlns:oel="http://schemas.microsoft.com/office/2019/extlst" xmlns:r="http://schemas.openxmlformats.org/officeDocument/2006/relationships" xmlns:wp14="http://schemas.microsoft.com/office/word/2010/wordprocessingDrawing" xmlns:wp="http://schemas.openxmlformats.org/drawingml/2006/wordprocessingDrawing" xmlns:wpg="http://schemas.microsoft.com/office/word/2010/wordprocessingGroup" xmlns:wpi="http://schemas.microsoft.com/office/word/2010/wordprocessingInk" xmlns:wps="http://schemas.microsoft.com/office/word/2010/wordprocessingShape" xmlns:o="urn:schemas-microsoft-com:office:office" xmlns:v="urn:schemas-microsoft-com:vml" xmlns:w10="urn:schemas-microsoft-com:office:word" xmlns:w="http://schemas.openxmlformats.org/wordprocessingml/2006/main" xmlns:w14="http://schemas.microsoft.com/office/word/2010/wordml" xmlns:w15="http://schemas.microsoft.com/office/word/2012/wordml" xmlns:w16cei="http://schemas.microsoft.com/office/word/2026/wordml/cei" xmlns:w16cex="http://schemas.microsoft.com/office/word/2018/wordml/cex" xmlns:w16cid="http://schemas.microsoft.com/office/word/2016/wordml/cid" xmlns:w16="http://schemas.microsoft.com/office/word/2018/wordml" xmlns:w16sdtdh="http://schemas.microsoft.com/office/word/2020/wordml/sdtdatahash" xmlns:w16sdtfl="http://schemas.microsoft.com/office/word/2024/wordml/sdtformatlock" xmlns:w16se="http://schemas.microsoft.com/office/word/2015/wordml/symex" xmlns:w16du="http://schemas.microsoft.com/office/word/2023/wordml/word16du" xmlns:wne="http://schemas.microsoft.com/office/word/2006/wordml" mc:Ignorable="w14 w15 w16se w16cid w16 w16cex w16sdtdh w16sdtfl w16du wp14">
   <w:p>
     <w:pPr>
       <w:pStyle w:val="Footer"/>
@@ -11921,7 +11748,7 @@
 </file>
 
 <file path=word/footer2.xml><?xml version="1.0" encoding="utf-8"?>
-<w:ftr xmlns:wpc="http://schemas.microsoft.com/office/word/2010/wordprocessingCanvas" xmlns:cx="http://schemas.microsoft.com/office/drawing/2014/chartex" xmlns:cx1="http://schemas.microsoft.com/office/drawing/2015/9/8/chartex" xmlns:cx2="http://schemas.microsoft.com/office/drawing/2015/10/21/chartex" xmlns:cx3="http://schemas.microsoft.com/office/drawing/2016/5/9/chartex" xmlns:cx4="http://schemas.microsoft.com/office/drawing/2016/5/10/chartex" xmlns:cx5="http://schemas.microsoft.com/office/drawing/2016/5/11/chartex" xmlns:cx6="http://schemas.microsoft.com/office/drawing/2016/5/12/chartex" xmlns:cx7="http://schemas.microsoft.com/office/drawing/2016/5/13/chartex" xmlns:cx8="http://schemas.microsoft.com/office/drawing/2016/5/14/chartex" xmlns:mc="http://schemas.openxmlformats.org/markup-compatibility/2006" xmlns:aink="http://schemas.microsoft.com/office/drawing/2016/ink" xmlns:am3d="http://schemas.microsoft.com/office/drawing/2017/model3d" xmlns:o="urn:schemas-microsoft-com:office:office" xmlns:oel="http://schemas.microsoft.com/office/2019/extlst" xmlns:r="http://schemas.openxmlformats.org/officeDocument/2006/relationships" xmlns:m="http://schemas.openxmlformats.org/officeDocument/2006/math" xmlns:v="urn:schemas-microsoft-com:vml" xmlns:wp14="http://schemas.microsoft.com/office/word/2010/wordprocessingDrawing" xmlns:wp="http://schemas.openxmlformats.org/drawingml/2006/wordprocessingDrawing" xmlns:w10="urn:schemas-microsoft-com:office:word" xmlns:w="http://schemas.openxmlformats.org/wordprocessingml/2006/main" xmlns:w14="http://schemas.microsoft.com/office/word/2010/wordml" xmlns:w15="http://schemas.microsoft.com/office/word/2012/wordml" xmlns:w16cex="http://schemas.microsoft.com/office/word/2018/wordml/cex" xmlns:w16cid="http://schemas.microsoft.com/office/word/2016/wordml/cid" xmlns:w16="http://schemas.microsoft.com/office/word/2018/wordml" xmlns:w16du="http://schemas.microsoft.com/office/word/2023/wordml/word16du" xmlns:w16sdtdh="http://schemas.microsoft.com/office/word/2020/wordml/sdtdatahash" xmlns:w16sdtfl="http://schemas.microsoft.com/office/word/2024/wordml/sdtformatlock" xmlns:w16se="http://schemas.microsoft.com/office/word/2015/wordml/symex" xmlns:wpg="http://schemas.microsoft.com/office/word/2010/wordprocessingGroup" xmlns:wpi="http://schemas.microsoft.com/office/word/2010/wordprocessingInk" xmlns:wne="http://schemas.microsoft.com/office/word/2006/wordml" xmlns:wps="http://schemas.microsoft.com/office/word/2010/wordprocessingShape" mc:Ignorable="w14 w15 w16se w16cid w16 w16cex w16sdtdh w16sdtfl w16du wp14">
+<w:ftr xmlns:wpc="http://schemas.microsoft.com/office/word/2010/wordprocessingCanvas" xmlns:cx="http://schemas.microsoft.com/office/drawing/2014/chartex" xmlns:cx1="http://schemas.microsoft.com/office/drawing/2015/9/8/chartex" xmlns:cx2="http://schemas.microsoft.com/office/drawing/2015/10/21/chartex" xmlns:cx3="http://schemas.microsoft.com/office/drawing/2016/5/9/chartex" xmlns:cx4="http://schemas.microsoft.com/office/drawing/2016/5/10/chartex" xmlns:cx5="http://schemas.microsoft.com/office/drawing/2016/5/11/chartex" xmlns:cx6="http://schemas.microsoft.com/office/drawing/2016/5/12/chartex" xmlns:cx7="http://schemas.microsoft.com/office/drawing/2016/5/13/chartex" xmlns:cx8="http://schemas.microsoft.com/office/drawing/2016/5/14/chartex" xmlns:mc="http://schemas.openxmlformats.org/markup-compatibility/2006" xmlns:m="http://schemas.openxmlformats.org/officeDocument/2006/math" xmlns:aink="http://schemas.microsoft.com/office/drawing/2016/ink" xmlns:am3d="http://schemas.microsoft.com/office/drawing/2017/model3d" xmlns:oel="http://schemas.microsoft.com/office/2019/extlst" xmlns:r="http://schemas.openxmlformats.org/officeDocument/2006/relationships" xmlns:wp14="http://schemas.microsoft.com/office/word/2010/wordprocessingDrawing" xmlns:wp="http://schemas.openxmlformats.org/drawingml/2006/wordprocessingDrawing" xmlns:wpg="http://schemas.microsoft.com/office/word/2010/wordprocessingGroup" xmlns:wpi="http://schemas.microsoft.com/office/word/2010/wordprocessingInk" xmlns:wps="http://schemas.microsoft.com/office/word/2010/wordprocessingShape" xmlns:o="urn:schemas-microsoft-com:office:office" xmlns:v="urn:schemas-microsoft-com:vml" xmlns:w10="urn:schemas-microsoft-com:office:word" xmlns:w="http://schemas.openxmlformats.org/wordprocessingml/2006/main" xmlns:w14="http://schemas.microsoft.com/office/word/2010/wordml" xmlns:w15="http://schemas.microsoft.com/office/word/2012/wordml" xmlns:w16cei="http://schemas.microsoft.com/office/word/2026/wordml/cei" xmlns:w16cex="http://schemas.microsoft.com/office/word/2018/wordml/cex" xmlns:w16cid="http://schemas.microsoft.com/office/word/2016/wordml/cid" xmlns:w16="http://schemas.microsoft.com/office/word/2018/wordml" xmlns:w16sdtdh="http://schemas.microsoft.com/office/word/2020/wordml/sdtdatahash" xmlns:w16sdtfl="http://schemas.microsoft.com/office/word/2024/wordml/sdtformatlock" xmlns:w16se="http://schemas.microsoft.com/office/word/2015/wordml/symex" xmlns:w16du="http://schemas.microsoft.com/office/word/2023/wordml/word16du" xmlns:wne="http://schemas.microsoft.com/office/word/2006/wordml" mc:Ignorable="w14 w15 w16se w16cid w16 w16cex w16sdtdh w16sdtfl w16du wp14">
   <w:p>
     <w:pPr>
       <w:pStyle w:val="Footer"/>
@@ -11956,7 +11783,7 @@
 </file>
 
 <file path=word/footer3.xml><?xml version="1.0" encoding="utf-8"?>
-<w:ftr xmlns:wpc="http://schemas.microsoft.com/office/word/2010/wordprocessingCanvas" xmlns:cx="http://schemas.microsoft.com/office/drawing/2014/chartex" xmlns:cx1="http://schemas.microsoft.com/office/drawing/2015/9/8/chartex" xmlns:cx2="http://schemas.microsoft.com/office/drawing/2015/10/21/chartex" xmlns:cx3="http://schemas.microsoft.com/office/drawing/2016/5/9/chartex" xmlns:cx4="http://schemas.microsoft.com/office/drawing/2016/5/10/chartex" xmlns:cx5="http://schemas.microsoft.com/office/drawing/2016/5/11/chartex" xmlns:cx6="http://schemas.microsoft.com/office/drawing/2016/5/12/chartex" xmlns:cx7="http://schemas.microsoft.com/office/drawing/2016/5/13/chartex" xmlns:cx8="http://schemas.microsoft.com/office/drawing/2016/5/14/chartex" xmlns:mc="http://schemas.openxmlformats.org/markup-compatibility/2006" xmlns:aink="http://schemas.microsoft.com/office/drawing/2016/ink" xmlns:am3d="http://schemas.microsoft.com/office/drawing/2017/model3d" xmlns:o="urn:schemas-microsoft-com:office:office" xmlns:oel="http://schemas.microsoft.com/office/2019/extlst" xmlns:r="http://schemas.openxmlformats.org/officeDocument/2006/relationships" xmlns:m="http://schemas.openxmlformats.org/officeDocument/2006/math" xmlns:v="urn:schemas-microsoft-com:vml" xmlns:wp14="http://schemas.microsoft.com/office/word/2010/wordprocessingDrawing" xmlns:wp="http://schemas.openxmlformats.org/drawingml/2006/wordprocessingDrawing" xmlns:w10="urn:schemas-microsoft-com:office:word" xmlns:w="http://schemas.openxmlformats.org/wordprocessingml/2006/main" xmlns:w14="http://schemas.microsoft.com/office/word/2010/wordml" xmlns:w15="http://schemas.microsoft.com/office/word/2012/wordml" xmlns:w16cex="http://schemas.microsoft.com/office/word/2018/wordml/cex" xmlns:w16cid="http://schemas.microsoft.com/office/word/2016/wordml/cid" xmlns:w16="http://schemas.microsoft.com/office/word/2018/wordml" xmlns:w16du="http://schemas.microsoft.com/office/word/2023/wordml/word16du" xmlns:w16sdtdh="http://schemas.microsoft.com/office/word/2020/wordml/sdtdatahash" xmlns:w16sdtfl="http://schemas.microsoft.com/office/word/2024/wordml/sdtformatlock" xmlns:w16se="http://schemas.microsoft.com/office/word/2015/wordml/symex" xmlns:wpg="http://schemas.microsoft.com/office/word/2010/wordprocessingGroup" xmlns:wpi="http://schemas.microsoft.com/office/word/2010/wordprocessingInk" xmlns:wne="http://schemas.microsoft.com/office/word/2006/wordml" xmlns:wps="http://schemas.microsoft.com/office/word/2010/wordprocessingShape" mc:Ignorable="w14 w15 w16se w16cid w16 w16cex w16sdtdh w16sdtfl w16du wp14">
+<w:ftr xmlns:wpc="http://schemas.microsoft.com/office/word/2010/wordprocessingCanvas" xmlns:cx="http://schemas.microsoft.com/office/drawing/2014/chartex" xmlns:cx1="http://schemas.microsoft.com/office/drawing/2015/9/8/chartex" xmlns:cx2="http://schemas.microsoft.com/office/drawing/2015/10/21/chartex" xmlns:cx3="http://schemas.microsoft.com/office/drawing/2016/5/9/chartex" xmlns:cx4="http://schemas.microsoft.com/office/drawing/2016/5/10/chartex" xmlns:cx5="http://schemas.microsoft.com/office/drawing/2016/5/11/chartex" xmlns:cx6="http://schemas.microsoft.com/office/drawing/2016/5/12/chartex" xmlns:cx7="http://schemas.microsoft.com/office/drawing/2016/5/13/chartex" xmlns:cx8="http://schemas.microsoft.com/office/drawing/2016/5/14/chartex" xmlns:mc="http://schemas.openxmlformats.org/markup-compatibility/2006" xmlns:m="http://schemas.openxmlformats.org/officeDocument/2006/math" xmlns:aink="http://schemas.microsoft.com/office/drawing/2016/ink" xmlns:am3d="http://schemas.microsoft.com/office/drawing/2017/model3d" xmlns:oel="http://schemas.microsoft.com/office/2019/extlst" xmlns:r="http://schemas.openxmlformats.org/officeDocument/2006/relationships" xmlns:wp14="http://schemas.microsoft.com/office/word/2010/wordprocessingDrawing" xmlns:wp="http://schemas.openxmlformats.org/drawingml/2006/wordprocessingDrawing" xmlns:wpg="http://schemas.microsoft.com/office/word/2010/wordprocessingGroup" xmlns:wpi="http://schemas.microsoft.com/office/word/2010/wordprocessingInk" xmlns:wps="http://schemas.microsoft.com/office/word/2010/wordprocessingShape" xmlns:o="urn:schemas-microsoft-com:office:office" xmlns:v="urn:schemas-microsoft-com:vml" xmlns:w10="urn:schemas-microsoft-com:office:word" xmlns:w="http://schemas.openxmlformats.org/wordprocessingml/2006/main" xmlns:w14="http://schemas.microsoft.com/office/word/2010/wordml" xmlns:w15="http://schemas.microsoft.com/office/word/2012/wordml" xmlns:w16cei="http://schemas.microsoft.com/office/word/2026/wordml/cei" xmlns:w16cex="http://schemas.microsoft.com/office/word/2018/wordml/cex" xmlns:w16cid="http://schemas.microsoft.com/office/word/2016/wordml/cid" xmlns:w16="http://schemas.microsoft.com/office/word/2018/wordml" xmlns:w16sdtdh="http://schemas.microsoft.com/office/word/2020/wordml/sdtdatahash" xmlns:w16sdtfl="http://schemas.microsoft.com/office/word/2024/wordml/sdtformatlock" xmlns:w16se="http://schemas.microsoft.com/office/word/2015/wordml/symex" xmlns:w16du="http://schemas.microsoft.com/office/word/2023/wordml/word16du" xmlns:wne="http://schemas.microsoft.com/office/word/2006/wordml" mc:Ignorable="w14 w15 w16se w16cid w16 w16cex w16sdtdh w16sdtfl w16du wp14">
   <w:p>
     <w:pPr>
       <w:pStyle w:val="Footer"/>
@@ -11991,7 +11818,7 @@
 </file>
 
 <file path=word/footnotes.xml><?xml version="1.0" encoding="utf-8"?>
-<w:footnotes xmlns:wpc="http://schemas.microsoft.com/office/word/2010/wordprocessingCanvas" xmlns:cx="http://schemas.microsoft.com/office/drawing/2014/chartex" xmlns:cx1="http://schemas.microsoft.com/office/drawing/2015/9/8/chartex" xmlns:cx2="http://schemas.microsoft.com/office/drawing/2015/10/21/chartex" xmlns:cx3="http://schemas.microsoft.com/office/drawing/2016/5/9/chartex" xmlns:cx4="http://schemas.microsoft.com/office/drawing/2016/5/10/chartex" xmlns:cx5="http://schemas.microsoft.com/office/drawing/2016/5/11/chartex" xmlns:cx6="http://schemas.microsoft.com/office/drawing/2016/5/12/chartex" xmlns:cx7="http://schemas.microsoft.com/office/drawing/2016/5/13/chartex" xmlns:cx8="http://schemas.microsoft.com/office/drawing/2016/5/14/chartex" xmlns:mc="http://schemas.openxmlformats.org/markup-compatibility/2006" xmlns:aink="http://schemas.microsoft.com/office/drawing/2016/ink" xmlns:am3d="http://schemas.microsoft.com/office/drawing/2017/model3d" xmlns:o="urn:schemas-microsoft-com:office:office" xmlns:oel="http://schemas.microsoft.com/office/2019/extlst" xmlns:r="http://schemas.openxmlformats.org/officeDocument/2006/relationships" xmlns:m="http://schemas.openxmlformats.org/officeDocument/2006/math" xmlns:v="urn:schemas-microsoft-com:vml" xmlns:wp14="http://schemas.microsoft.com/office/word/2010/wordprocessingDrawing" xmlns:wp="http://schemas.openxmlformats.org/drawingml/2006/wordprocessingDrawing" xmlns:w10="urn:schemas-microsoft-com:office:word" xmlns:w="http://schemas.openxmlformats.org/wordprocessingml/2006/main" xmlns:w14="http://schemas.microsoft.com/office/word/2010/wordml" xmlns:w15="http://schemas.microsoft.com/office/word/2012/wordml" xmlns:w16cex="http://schemas.microsoft.com/office/word/2018/wordml/cex" xmlns:w16cid="http://schemas.microsoft.com/office/word/2016/wordml/cid" xmlns:w16="http://schemas.microsoft.com/office/word/2018/wordml" xmlns:w16du="http://schemas.microsoft.com/office/word/2023/wordml/word16du" xmlns:w16sdtdh="http://schemas.microsoft.com/office/word/2020/wordml/sdtdatahash" xmlns:w16sdtfl="http://schemas.microsoft.com/office/word/2024/wordml/sdtformatlock" xmlns:w16se="http://schemas.microsoft.com/office/word/2015/wordml/symex" xmlns:wpg="http://schemas.microsoft.com/office/word/2010/wordprocessingGroup" xmlns:wpi="http://schemas.microsoft.com/office/word/2010/wordprocessingInk" xmlns:wne="http://schemas.microsoft.com/office/word/2006/wordml" xmlns:wps="http://schemas.microsoft.com/office/word/2010/wordprocessingShape" mc:Ignorable="w14 w15 w16se w16cid w16 w16cex w16sdtdh w16sdtfl w16du wp14">
+<w:footnotes xmlns:wpc="http://schemas.microsoft.com/office/word/2010/wordprocessingCanvas" xmlns:cx="http://schemas.microsoft.com/office/drawing/2014/chartex" xmlns:cx1="http://schemas.microsoft.com/office/drawing/2015/9/8/chartex" xmlns:cx2="http://schemas.microsoft.com/office/drawing/2015/10/21/chartex" xmlns:cx3="http://schemas.microsoft.com/office/drawing/2016/5/9/chartex" xmlns:cx4="http://schemas.microsoft.com/office/drawing/2016/5/10/chartex" xmlns:cx5="http://schemas.microsoft.com/office/drawing/2016/5/11/chartex" xmlns:cx6="http://schemas.microsoft.com/office/drawing/2016/5/12/chartex" xmlns:cx7="http://schemas.microsoft.com/office/drawing/2016/5/13/chartex" xmlns:cx8="http://schemas.microsoft.com/office/drawing/2016/5/14/chartex" xmlns:mc="http://schemas.openxmlformats.org/markup-compatibility/2006" xmlns:m="http://schemas.openxmlformats.org/officeDocument/2006/math" xmlns:aink="http://schemas.microsoft.com/office/drawing/2016/ink" xmlns:am3d="http://schemas.microsoft.com/office/drawing/2017/model3d" xmlns:oel="http://schemas.microsoft.com/office/2019/extlst" xmlns:r="http://schemas.openxmlformats.org/officeDocument/2006/relationships" xmlns:wp14="http://schemas.microsoft.com/office/word/2010/wordprocessingDrawing" xmlns:wp="http://schemas.openxmlformats.org/drawingml/2006/wordprocessingDrawing" xmlns:wpg="http://schemas.microsoft.com/office/word/2010/wordprocessingGroup" xmlns:wpi="http://schemas.microsoft.com/office/word/2010/wordprocessingInk" xmlns:wps="http://schemas.microsoft.com/office/word/2010/wordprocessingShape" xmlns:o="urn:schemas-microsoft-com:office:office" xmlns:v="urn:schemas-microsoft-com:vml" xmlns:w10="urn:schemas-microsoft-com:office:word" xmlns:w="http://schemas.openxmlformats.org/wordprocessingml/2006/main" xmlns:w14="http://schemas.microsoft.com/office/word/2010/wordml" xmlns:w15="http://schemas.microsoft.com/office/word/2012/wordml" xmlns:w16cei="http://schemas.microsoft.com/office/word/2026/wordml/cei" xmlns:w16cex="http://schemas.microsoft.com/office/word/2018/wordml/cex" xmlns:w16cid="http://schemas.microsoft.com/office/word/2016/wordml/cid" xmlns:w16="http://schemas.microsoft.com/office/word/2018/wordml" xmlns:w16sdtdh="http://schemas.microsoft.com/office/word/2020/wordml/sdtdatahash" xmlns:w16sdtfl="http://schemas.microsoft.com/office/word/2024/wordml/sdtformatlock" xmlns:w16se="http://schemas.microsoft.com/office/word/2015/wordml/symex" xmlns:w16du="http://schemas.microsoft.com/office/word/2023/wordml/word16du" xmlns:wne="http://schemas.microsoft.com/office/word/2006/wordml" mc:Ignorable="w14 w15 w16se w16cid w16 w16cex w16sdtdh w16sdtfl w16du wp14">
   <w:footnote w:type="separator" w:id="-1">
     <w:p>
       <w:pPr>
@@ -12016,7 +11843,7 @@
 </file>
 
 <file path=word/header1.xml><?xml version="1.0" encoding="utf-8"?>
-<w:hdr xmlns:wpc="http://schemas.microsoft.com/office/word/2010/wordprocessingCanvas" xmlns:cx="http://schemas.microsoft.com/office/drawing/2014/chartex" xmlns:cx1="http://schemas.microsoft.com/office/drawing/2015/9/8/chartex" xmlns:cx2="http://schemas.microsoft.com/office/drawing/2015/10/21/chartex" xmlns:cx3="http://schemas.microsoft.com/office/drawing/2016/5/9/chartex" xmlns:cx4="http://schemas.microsoft.com/office/drawing/2016/5/10/chartex" xmlns:cx5="http://schemas.microsoft.com/office/drawing/2016/5/11/chartex" xmlns:cx6="http://schemas.microsoft.com/office/drawing/2016/5/12/chartex" xmlns:cx7="http://schemas.microsoft.com/office/drawing/2016/5/13/chartex" xmlns:cx8="http://schemas.microsoft.com/office/drawing/2016/5/14/chartex" xmlns:mc="http://schemas.openxmlformats.org/markup-compatibility/2006" xmlns:aink="http://schemas.microsoft.com/office/drawing/2016/ink" xmlns:am3d="http://schemas.microsoft.com/office/drawing/2017/model3d" xmlns:o="urn:schemas-microsoft-com:office:office" xmlns:oel="http://schemas.microsoft.com/office/2019/extlst" xmlns:r="http://schemas.openxmlformats.org/officeDocument/2006/relationships" xmlns:m="http://schemas.openxmlformats.org/officeDocument/2006/math" xmlns:v="urn:schemas-microsoft-com:vml" xmlns:wp14="http://schemas.microsoft.com/office/word/2010/wordprocessingDrawing" xmlns:wp="http://schemas.openxmlformats.org/drawingml/2006/wordprocessingDrawing" xmlns:w10="urn:schemas-microsoft-com:office:word" xmlns:w="http://schemas.openxmlformats.org/wordprocessingml/2006/main" xmlns:w14="http://schemas.microsoft.com/office/word/2010/wordml" xmlns:w15="http://schemas.microsoft.com/office/word/2012/wordml" xmlns:w16cex="http://schemas.microsoft.com/office/word/2018/wordml/cex" xmlns:w16cid="http://schemas.microsoft.com/office/word/2016/wordml/cid" xmlns:w16="http://schemas.microsoft.com/office/word/2018/wordml" xmlns:w16du="http://schemas.microsoft.com/office/word/2023/wordml/word16du" xmlns:w16sdtdh="http://schemas.microsoft.com/office/word/2020/wordml/sdtdatahash" xmlns:w16sdtfl="http://schemas.microsoft.com/office/word/2024/wordml/sdtformatlock" xmlns:w16se="http://schemas.microsoft.com/office/word/2015/wordml/symex" xmlns:wpg="http://schemas.microsoft.com/office/word/2010/wordprocessingGroup" xmlns:wpi="http://schemas.microsoft.com/office/word/2010/wordprocessingInk" xmlns:wne="http://schemas.microsoft.com/office/word/2006/wordml" xmlns:wps="http://schemas.microsoft.com/office/word/2010/wordprocessingShape" mc:Ignorable="w14 w15 w16se w16cid w16 w16cex w16sdtdh w16sdtfl w16du wp14">
+<w:hdr xmlns:wpc="http://schemas.microsoft.com/office/word/2010/wordprocessingCanvas" xmlns:cx="http://schemas.microsoft.com/office/drawing/2014/chartex" xmlns:cx1="http://schemas.microsoft.com/office/drawing/2015/9/8/chartex" xmlns:cx2="http://schemas.microsoft.com/office/drawing/2015/10/21/chartex" xmlns:cx3="http://schemas.microsoft.com/office/drawing/2016/5/9/chartex" xmlns:cx4="http://schemas.microsoft.com/office/drawing/2016/5/10/chartex" xmlns:cx5="http://schemas.microsoft.com/office/drawing/2016/5/11/chartex" xmlns:cx6="http://schemas.microsoft.com/office/drawing/2016/5/12/chartex" xmlns:cx7="http://schemas.microsoft.com/office/drawing/2016/5/13/chartex" xmlns:cx8="http://schemas.microsoft.com/office/drawing/2016/5/14/chartex" xmlns:mc="http://schemas.openxmlformats.org/markup-compatibility/2006" xmlns:m="http://schemas.openxmlformats.org/officeDocument/2006/math" xmlns:aink="http://schemas.microsoft.com/office/drawing/2016/ink" xmlns:am3d="http://schemas.microsoft.com/office/drawing/2017/model3d" xmlns:oel="http://schemas.microsoft.com/office/2019/extlst" xmlns:r="http://schemas.openxmlformats.org/officeDocument/2006/relationships" xmlns:wp14="http://schemas.microsoft.com/office/word/2010/wordprocessingDrawing" xmlns:wp="http://schemas.openxmlformats.org/drawingml/2006/wordprocessingDrawing" xmlns:wpg="http://schemas.microsoft.com/office/word/2010/wordprocessingGroup" xmlns:wpi="http://schemas.microsoft.com/office/word/2010/wordprocessingInk" xmlns:wps="http://schemas.microsoft.com/office/word/2010/wordprocessingShape" xmlns:o="urn:schemas-microsoft-com:office:office" xmlns:v="urn:schemas-microsoft-com:vml" xmlns:w10="urn:schemas-microsoft-com:office:word" xmlns:w="http://schemas.openxmlformats.org/wordprocessingml/2006/main" xmlns:w14="http://schemas.microsoft.com/office/word/2010/wordml" xmlns:w15="http://schemas.microsoft.com/office/word/2012/wordml" xmlns:w16cei="http://schemas.microsoft.com/office/word/2026/wordml/cei" xmlns:w16cex="http://schemas.microsoft.com/office/word/2018/wordml/cex" xmlns:w16cid="http://schemas.microsoft.com/office/word/2016/wordml/cid" xmlns:w16="http://schemas.microsoft.com/office/word/2018/wordml" xmlns:w16sdtdh="http://schemas.microsoft.com/office/word/2020/wordml/sdtdatahash" xmlns:w16sdtfl="http://schemas.microsoft.com/office/word/2024/wordml/sdtformatlock" xmlns:w16se="http://schemas.microsoft.com/office/word/2015/wordml/symex" xmlns:w16du="http://schemas.microsoft.com/office/word/2023/wordml/word16du" xmlns:wne="http://schemas.microsoft.com/office/word/2006/wordml" mc:Ignorable="w14 w15 w16se w16cid w16 w16cex w16sdtdh w16sdtfl w16du wp14">
   <w:p>
     <w:pPr>
       <w:pStyle w:val="Header"/>
@@ -12097,7 +11924,7 @@
 </file>
 
 <file path=word/header2.xml><?xml version="1.0" encoding="utf-8"?>
-<w:hdr xmlns:wpc="http://schemas.microsoft.com/office/word/2010/wordprocessingCanvas" xmlns:cx="http://schemas.microsoft.com/office/drawing/2014/chartex" xmlns:cx1="http://schemas.microsoft.com/office/drawing/2015/9/8/chartex" xmlns:cx2="http://schemas.microsoft.com/office/drawing/2015/10/21/chartex" xmlns:cx3="http://schemas.microsoft.com/office/drawing/2016/5/9/chartex" xmlns:cx4="http://schemas.microsoft.com/office/drawing/2016/5/10/chartex" xmlns:cx5="http://schemas.microsoft.com/office/drawing/2016/5/11/chartex" xmlns:cx6="http://schemas.microsoft.com/office/drawing/2016/5/12/chartex" xmlns:cx7="http://schemas.microsoft.com/office/drawing/2016/5/13/chartex" xmlns:cx8="http://schemas.microsoft.com/office/drawing/2016/5/14/chartex" xmlns:mc="http://schemas.openxmlformats.org/markup-compatibility/2006" xmlns:aink="http://schemas.microsoft.com/office/drawing/2016/ink" xmlns:am3d="http://schemas.microsoft.com/office/drawing/2017/model3d" xmlns:o="urn:schemas-microsoft-com:office:office" xmlns:oel="http://schemas.microsoft.com/office/2019/extlst" xmlns:r="http://schemas.openxmlformats.org/officeDocument/2006/relationships" xmlns:m="http://schemas.openxmlformats.org/officeDocument/2006/math" xmlns:v="urn:schemas-microsoft-com:vml" xmlns:wp14="http://schemas.microsoft.com/office/word/2010/wordprocessingDrawing" xmlns:wp="http://schemas.openxmlformats.org/drawingml/2006/wordprocessingDrawing" xmlns:w10="urn:schemas-microsoft-com:office:word" xmlns:w="http://schemas.openxmlformats.org/wordprocessingml/2006/main" xmlns:w14="http://schemas.microsoft.com/office/word/2010/wordml" xmlns:w15="http://schemas.microsoft.com/office/word/2012/wordml" xmlns:w16cex="http://schemas.microsoft.com/office/word/2018/wordml/cex" xmlns:w16cid="http://schemas.microsoft.com/office/word/2016/wordml/cid" xmlns:w16="http://schemas.microsoft.com/office/word/2018/wordml" xmlns:w16du="http://schemas.microsoft.com/office/word/2023/wordml/word16du" xmlns:w16sdtdh="http://schemas.microsoft.com/office/word/2020/wordml/sdtdatahash" xmlns:w16sdtfl="http://schemas.microsoft.com/office/word/2024/wordml/sdtformatlock" xmlns:w16se="http://schemas.microsoft.com/office/word/2015/wordml/symex" xmlns:wpg="http://schemas.microsoft.com/office/word/2010/wordprocessingGroup" xmlns:wpi="http://schemas.microsoft.com/office/word/2010/wordprocessingInk" xmlns:wne="http://schemas.microsoft.com/office/word/2006/wordml" xmlns:wps="http://schemas.microsoft.com/office/word/2010/wordprocessingShape" mc:Ignorable="w14 w15 w16se w16cid w16 w16cex w16sdtdh w16sdtfl w16du wp14">
+<w:hdr xmlns:wpc="http://schemas.microsoft.com/office/word/2010/wordprocessingCanvas" xmlns:cx="http://schemas.microsoft.com/office/drawing/2014/chartex" xmlns:cx1="http://schemas.microsoft.com/office/drawing/2015/9/8/chartex" xmlns:cx2="http://schemas.microsoft.com/office/drawing/2015/10/21/chartex" xmlns:cx3="http://schemas.microsoft.com/office/drawing/2016/5/9/chartex" xmlns:cx4="http://schemas.microsoft.com/office/drawing/2016/5/10/chartex" xmlns:cx5="http://schemas.microsoft.com/office/drawing/2016/5/11/chartex" xmlns:cx6="http://schemas.microsoft.com/office/drawing/2016/5/12/chartex" xmlns:cx7="http://schemas.microsoft.com/office/drawing/2016/5/13/chartex" xmlns:cx8="http://schemas.microsoft.com/office/drawing/2016/5/14/chartex" xmlns:mc="http://schemas.openxmlformats.org/markup-compatibility/2006" xmlns:m="http://schemas.openxmlformats.org/officeDocument/2006/math" xmlns:aink="http://schemas.microsoft.com/office/drawing/2016/ink" xmlns:am3d="http://schemas.microsoft.com/office/drawing/2017/model3d" xmlns:oel="http://schemas.microsoft.com/office/2019/extlst" xmlns:r="http://schemas.openxmlformats.org/officeDocument/2006/relationships" xmlns:wp14="http://schemas.microsoft.com/office/word/2010/wordprocessingDrawing" xmlns:wp="http://schemas.openxmlformats.org/drawingml/2006/wordprocessingDrawing" xmlns:wpg="http://schemas.microsoft.com/office/word/2010/wordprocessingGroup" xmlns:wpi="http://schemas.microsoft.com/office/word/2010/wordprocessingInk" xmlns:wps="http://schemas.microsoft.com/office/word/2010/wordprocessingShape" xmlns:o="urn:schemas-microsoft-com:office:office" xmlns:v="urn:schemas-microsoft-com:vml" xmlns:w10="urn:schemas-microsoft-com:office:word" xmlns:w="http://schemas.openxmlformats.org/wordprocessingml/2006/main" xmlns:w14="http://schemas.microsoft.com/office/word/2010/wordml" xmlns:w15="http://schemas.microsoft.com/office/word/2012/wordml" xmlns:w16cei="http://schemas.microsoft.com/office/word/2026/wordml/cei" xmlns:w16cex="http://schemas.microsoft.com/office/word/2018/wordml/cex" xmlns:w16cid="http://schemas.microsoft.com/office/word/2016/wordml/cid" xmlns:w16="http://schemas.microsoft.com/office/word/2018/wordml" xmlns:w16sdtdh="http://schemas.microsoft.com/office/word/2020/wordml/sdtdatahash" xmlns:w16sdtfl="http://schemas.microsoft.com/office/word/2024/wordml/sdtformatlock" xmlns:w16se="http://schemas.microsoft.com/office/word/2015/wordml/symex" xmlns:w16du="http://schemas.microsoft.com/office/word/2023/wordml/word16du" xmlns:wne="http://schemas.microsoft.com/office/word/2006/wordml" mc:Ignorable="w14 w15 w16se w16cid w16 w16cex w16sdtdh w16sdtfl w16du wp14">
   <w:p>
     <w:pPr>
       <w:pStyle w:val="Header"/>
@@ -12165,23 +11992,7 @@
         <w:color w:val="4B5563"/>
         <w:sz w:val="17"/>
       </w:rPr>
-      <w:t xml:space="preserve"> </w:t>
-    </w:r>
-    <w:proofErr w:type="spellStart"/>
-    <w:r>
-      <w:rPr>
-        <w:color w:val="4B5563"/>
-        <w:sz w:val="17"/>
-      </w:rPr>
-      <w:t>Deret</w:t>
-    </w:r>
-    <w:proofErr w:type="spellEnd"/>
-    <w:r>
-      <w:rPr>
-        <w:color w:val="4B5563"/>
-        <w:sz w:val="17"/>
-      </w:rPr>
-      <w:t xml:space="preserve"> Waktu Tingkat </w:t>
+      <w:t xml:space="preserve"> Deret Waktu Tingkat </w:t>
     </w:r>
     <w:proofErr w:type="spellStart"/>
     <w:r>
@@ -12197,7 +12008,7 @@
 </file>
 
 <file path=word/header3.xml><?xml version="1.0" encoding="utf-8"?>
-<w:hdr xmlns:wpc="http://schemas.microsoft.com/office/word/2010/wordprocessingCanvas" xmlns:cx="http://schemas.microsoft.com/office/drawing/2014/chartex" xmlns:cx1="http://schemas.microsoft.com/office/drawing/2015/9/8/chartex" xmlns:cx2="http://schemas.microsoft.com/office/drawing/2015/10/21/chartex" xmlns:cx3="http://schemas.microsoft.com/office/drawing/2016/5/9/chartex" xmlns:cx4="http://schemas.microsoft.com/office/drawing/2016/5/10/chartex" xmlns:cx5="http://schemas.microsoft.com/office/drawing/2016/5/11/chartex" xmlns:cx6="http://schemas.microsoft.com/office/drawing/2016/5/12/chartex" xmlns:cx7="http://schemas.microsoft.com/office/drawing/2016/5/13/chartex" xmlns:cx8="http://schemas.microsoft.com/office/drawing/2016/5/14/chartex" xmlns:mc="http://schemas.openxmlformats.org/markup-compatibility/2006" xmlns:aink="http://schemas.microsoft.com/office/drawing/2016/ink" xmlns:am3d="http://schemas.microsoft.com/office/drawing/2017/model3d" xmlns:o="urn:schemas-microsoft-com:office:office" xmlns:oel="http://schemas.microsoft.com/office/2019/extlst" xmlns:r="http://schemas.openxmlformats.org/officeDocument/2006/relationships" xmlns:m="http://schemas.openxmlformats.org/officeDocument/2006/math" xmlns:v="urn:schemas-microsoft-com:vml" xmlns:wp14="http://schemas.microsoft.com/office/word/2010/wordprocessingDrawing" xmlns:wp="http://schemas.openxmlformats.org/drawingml/2006/wordprocessingDrawing" xmlns:w10="urn:schemas-microsoft-com:office:word" xmlns:w="http://schemas.openxmlformats.org/wordprocessingml/2006/main" xmlns:w14="http://schemas.microsoft.com/office/word/2010/wordml" xmlns:w15="http://schemas.microsoft.com/office/word/2012/wordml" xmlns:w16cex="http://schemas.microsoft.com/office/word/2018/wordml/cex" xmlns:w16cid="http://schemas.microsoft.com/office/word/2016/wordml/cid" xmlns:w16="http://schemas.microsoft.com/office/word/2018/wordml" xmlns:w16du="http://schemas.microsoft.com/office/word/2023/wordml/word16du" xmlns:w16sdtdh="http://schemas.microsoft.com/office/word/2020/wordml/sdtdatahash" xmlns:w16sdtfl="http://schemas.microsoft.com/office/word/2024/wordml/sdtformatlock" xmlns:w16se="http://schemas.microsoft.com/office/word/2015/wordml/symex" xmlns:wpg="http://schemas.microsoft.com/office/word/2010/wordprocessingGroup" xmlns:wpi="http://schemas.microsoft.com/office/word/2010/wordprocessingInk" xmlns:wne="http://schemas.microsoft.com/office/word/2006/wordml" xmlns:wps="http://schemas.microsoft.com/office/word/2010/wordprocessingShape" mc:Ignorable="w14 w15 w16se w16cid w16 w16cex w16sdtdh w16sdtfl w16du wp14">
+<w:hdr xmlns:wpc="http://schemas.microsoft.com/office/word/2010/wordprocessingCanvas" xmlns:cx="http://schemas.microsoft.com/office/drawing/2014/chartex" xmlns:cx1="http://schemas.microsoft.com/office/drawing/2015/9/8/chartex" xmlns:cx2="http://schemas.microsoft.com/office/drawing/2015/10/21/chartex" xmlns:cx3="http://schemas.microsoft.com/office/drawing/2016/5/9/chartex" xmlns:cx4="http://schemas.microsoft.com/office/drawing/2016/5/10/chartex" xmlns:cx5="http://schemas.microsoft.com/office/drawing/2016/5/11/chartex" xmlns:cx6="http://schemas.microsoft.com/office/drawing/2016/5/12/chartex" xmlns:cx7="http://schemas.microsoft.com/office/drawing/2016/5/13/chartex" xmlns:cx8="http://schemas.microsoft.com/office/drawing/2016/5/14/chartex" xmlns:mc="http://schemas.openxmlformats.org/markup-compatibility/2006" xmlns:m="http://schemas.openxmlformats.org/officeDocument/2006/math" xmlns:aink="http://schemas.microsoft.com/office/drawing/2016/ink" xmlns:am3d="http://schemas.microsoft.com/office/drawing/2017/model3d" xmlns:oel="http://schemas.microsoft.com/office/2019/extlst" xmlns:r="http://schemas.openxmlformats.org/officeDocument/2006/relationships" xmlns:wp14="http://schemas.microsoft.com/office/word/2010/wordprocessingDrawing" xmlns:wp="http://schemas.openxmlformats.org/drawingml/2006/wordprocessingDrawing" xmlns:wpg="http://schemas.microsoft.com/office/word/2010/wordprocessingGroup" xmlns:wpi="http://schemas.microsoft.com/office/word/2010/wordprocessingInk" xmlns:wps="http://schemas.microsoft.com/office/word/2010/wordprocessingShape" xmlns:o="urn:schemas-microsoft-com:office:office" xmlns:v="urn:schemas-microsoft-com:vml" xmlns:w10="urn:schemas-microsoft-com:office:word" xmlns:w="http://schemas.openxmlformats.org/wordprocessingml/2006/main" xmlns:w14="http://schemas.microsoft.com/office/word/2010/wordml" xmlns:w15="http://schemas.microsoft.com/office/word/2012/wordml" xmlns:w16cei="http://schemas.microsoft.com/office/word/2026/wordml/cei" xmlns:w16cex="http://schemas.microsoft.com/office/word/2018/wordml/cex" xmlns:w16cid="http://schemas.microsoft.com/office/word/2016/wordml/cid" xmlns:w16="http://schemas.microsoft.com/office/word/2018/wordml" xmlns:w16sdtdh="http://schemas.microsoft.com/office/word/2020/wordml/sdtdatahash" xmlns:w16sdtfl="http://schemas.microsoft.com/office/word/2024/wordml/sdtformatlock" xmlns:w16se="http://schemas.microsoft.com/office/word/2015/wordml/symex" xmlns:w16du="http://schemas.microsoft.com/office/word/2023/wordml/word16du" xmlns:wne="http://schemas.microsoft.com/office/word/2006/wordml" mc:Ignorable="w14 w15 w16se w16cid w16 w16cex w16sdtdh w16sdtfl w16du wp14">
   <w:p>
     <w:pPr>
       <w:pStyle w:val="Header"/>
@@ -12249,23 +12060,7 @@
         <w:color w:val="4B5563"/>
         <w:sz w:val="17"/>
       </w:rPr>
-      <w:t xml:space="preserve"> </w:t>
-    </w:r>
-    <w:proofErr w:type="spellStart"/>
-    <w:r>
-      <w:rPr>
-        <w:color w:val="4B5563"/>
-        <w:sz w:val="17"/>
-      </w:rPr>
-      <w:t>Deret</w:t>
-    </w:r>
-    <w:proofErr w:type="spellEnd"/>
-    <w:r>
-      <w:rPr>
-        <w:color w:val="4B5563"/>
-        <w:sz w:val="17"/>
-      </w:rPr>
-      <w:t xml:space="preserve"> Waktu Tingkat </w:t>
+      <w:t xml:space="preserve"> Deret Waktu Tingkat </w:t>
     </w:r>
     <w:proofErr w:type="spellStart"/>
     <w:r>
@@ -12320,7 +12115,7 @@
 </file>
 
 <file path=word/numbering.xml><?xml version="1.0" encoding="utf-8"?>
-<w:numbering xmlns:wpc="http://schemas.microsoft.com/office/word/2010/wordprocessingCanvas" xmlns:cx="http://schemas.microsoft.com/office/drawing/2014/chartex" xmlns:cx1="http://schemas.microsoft.com/office/drawing/2015/9/8/chartex" xmlns:cx2="http://schemas.microsoft.com/office/drawing/2015/10/21/chartex" xmlns:cx3="http://schemas.microsoft.com/office/drawing/2016/5/9/chartex" xmlns:cx4="http://schemas.microsoft.com/office/drawing/2016/5/10/chartex" xmlns:cx5="http://schemas.microsoft.com/office/drawing/2016/5/11/chartex" xmlns:cx6="http://schemas.microsoft.com/office/drawing/2016/5/12/chartex" xmlns:cx7="http://schemas.microsoft.com/office/drawing/2016/5/13/chartex" xmlns:cx8="http://schemas.microsoft.com/office/drawing/2016/5/14/chartex" xmlns:mc="http://schemas.openxmlformats.org/markup-compatibility/2006" xmlns:aink="http://schemas.microsoft.com/office/drawing/2016/ink" xmlns:am3d="http://schemas.microsoft.com/office/drawing/2017/model3d" xmlns:o="urn:schemas-microsoft-com:office:office" xmlns:oel="http://schemas.microsoft.com/office/2019/extlst" xmlns:r="http://schemas.openxmlformats.org/officeDocument/2006/relationships" xmlns:m="http://schemas.openxmlformats.org/officeDocument/2006/math" xmlns:v="urn:schemas-microsoft-com:vml" xmlns:wp14="http://schemas.microsoft.com/office/word/2010/wordprocessingDrawing" xmlns:wp="http://schemas.openxmlformats.org/drawingml/2006/wordprocessingDrawing" xmlns:w10="urn:schemas-microsoft-com:office:word" xmlns:w="http://schemas.openxmlformats.org/wordprocessingml/2006/main" xmlns:w14="http://schemas.microsoft.com/office/word/2010/wordml" xmlns:w15="http://schemas.microsoft.com/office/word/2012/wordml" xmlns:w16cex="http://schemas.microsoft.com/office/word/2018/wordml/cex" xmlns:w16cid="http://schemas.microsoft.com/office/word/2016/wordml/cid" xmlns:w16="http://schemas.microsoft.com/office/word/2018/wordml" xmlns:w16du="http://schemas.microsoft.com/office/word/2023/wordml/word16du" xmlns:w16sdtdh="http://schemas.microsoft.com/office/word/2020/wordml/sdtdatahash" xmlns:w16sdtfl="http://schemas.microsoft.com/office/word/2024/wordml/sdtformatlock" xmlns:w16se="http://schemas.microsoft.com/office/word/2015/wordml/symex" xmlns:wpg="http://schemas.microsoft.com/office/word/2010/wordprocessingGroup" xmlns:wpi="http://schemas.microsoft.com/office/word/2010/wordprocessingInk" xmlns:wne="http://schemas.microsoft.com/office/word/2006/wordml" xmlns:wps="http://schemas.microsoft.com/office/word/2010/wordprocessingShape" mc:Ignorable="w14 w15 w16se w16cid w16 w16cex w16sdtdh w16sdtfl w16du wp14">
+<w:numbering xmlns:wpc="http://schemas.microsoft.com/office/word/2010/wordprocessingCanvas" xmlns:cx="http://schemas.microsoft.com/office/drawing/2014/chartex" xmlns:cx1="http://schemas.microsoft.com/office/drawing/2015/9/8/chartex" xmlns:cx2="http://schemas.microsoft.com/office/drawing/2015/10/21/chartex" xmlns:cx3="http://schemas.microsoft.com/office/drawing/2016/5/9/chartex" xmlns:cx4="http://schemas.microsoft.com/office/drawing/2016/5/10/chartex" xmlns:cx5="http://schemas.microsoft.com/office/drawing/2016/5/11/chartex" xmlns:cx6="http://schemas.microsoft.com/office/drawing/2016/5/12/chartex" xmlns:cx7="http://schemas.microsoft.com/office/drawing/2016/5/13/chartex" xmlns:cx8="http://schemas.microsoft.com/office/drawing/2016/5/14/chartex" xmlns:mc="http://schemas.openxmlformats.org/markup-compatibility/2006" xmlns:m="http://schemas.openxmlformats.org/officeDocument/2006/math" xmlns:aink="http://schemas.microsoft.com/office/drawing/2016/ink" xmlns:am3d="http://schemas.microsoft.com/office/drawing/2017/model3d" xmlns:oel="http://schemas.microsoft.com/office/2019/extlst" xmlns:r="http://schemas.openxmlformats.org/officeDocument/2006/relationships" xmlns:wp14="http://schemas.microsoft.com/office/word/2010/wordprocessingDrawing" xmlns:wp="http://schemas.openxmlformats.org/drawingml/2006/wordprocessingDrawing" xmlns:wpg="http://schemas.microsoft.com/office/word/2010/wordprocessingGroup" xmlns:wpi="http://schemas.microsoft.com/office/word/2010/wordprocessingInk" xmlns:wps="http://schemas.microsoft.com/office/word/2010/wordprocessingShape" xmlns:o="urn:schemas-microsoft-com:office:office" xmlns:v="urn:schemas-microsoft-com:vml" xmlns:w10="urn:schemas-microsoft-com:office:word" xmlns:w="http://schemas.openxmlformats.org/wordprocessingml/2006/main" xmlns:w14="http://schemas.microsoft.com/office/word/2010/wordml" xmlns:w15="http://schemas.microsoft.com/office/word/2012/wordml" xmlns:w16cei="http://schemas.microsoft.com/office/word/2026/wordml/cei" xmlns:w16cex="http://schemas.microsoft.com/office/word/2018/wordml/cex" xmlns:w16cid="http://schemas.microsoft.com/office/word/2016/wordml/cid" xmlns:w16="http://schemas.microsoft.com/office/word/2018/wordml" xmlns:w16sdtdh="http://schemas.microsoft.com/office/word/2020/wordml/sdtdatahash" xmlns:w16sdtfl="http://schemas.microsoft.com/office/word/2024/wordml/sdtformatlock" xmlns:w16se="http://schemas.microsoft.com/office/word/2015/wordml/symex" xmlns:w16du="http://schemas.microsoft.com/office/word/2023/wordml/word16du" xmlns:wne="http://schemas.microsoft.com/office/word/2006/wordml" mc:Ignorable="w14 w15 w16se w16cid w16 w16cex w16sdtdh w16sdtfl w16du wp14">
   <w:abstractNum w:abstractNumId="0" w15:restartNumberingAfterBreak="0">
     <w:nsid w:val="FFFFFF7C"/>
     <w:multiLevelType w:val="singleLevel"/>
@@ -12887,7 +12682,7 @@
 </file>
 
 <file path=word/styles.xml><?xml version="1.0" encoding="utf-8"?>
-<w:styles xmlns:mc="http://schemas.openxmlformats.org/markup-compatibility/2006" xmlns:r="http://schemas.openxmlformats.org/officeDocument/2006/relationships" xmlns:w="http://schemas.openxmlformats.org/wordprocessingml/2006/main" xmlns:w14="http://schemas.microsoft.com/office/word/2010/wordml" xmlns:w15="http://schemas.microsoft.com/office/word/2012/wordml" xmlns:w16cex="http://schemas.microsoft.com/office/word/2018/wordml/cex" xmlns:w16cid="http://schemas.microsoft.com/office/word/2016/wordml/cid" xmlns:w16="http://schemas.microsoft.com/office/word/2018/wordml" xmlns:w16du="http://schemas.microsoft.com/office/word/2023/wordml/word16du" xmlns:w16sdtdh="http://schemas.microsoft.com/office/word/2020/wordml/sdtdatahash" xmlns:w16sdtfl="http://schemas.microsoft.com/office/word/2024/wordml/sdtformatlock" xmlns:w16se="http://schemas.microsoft.com/office/word/2015/wordml/symex" mc:Ignorable="w14 w15 w16se w16cid w16 w16cex w16sdtdh w16sdtfl w16du">
+<w:styles xmlns:mc="http://schemas.openxmlformats.org/markup-compatibility/2006" xmlns:r="http://schemas.openxmlformats.org/officeDocument/2006/relationships" xmlns:w="http://schemas.openxmlformats.org/wordprocessingml/2006/main" xmlns:w14="http://schemas.microsoft.com/office/word/2010/wordml" xmlns:w15="http://schemas.microsoft.com/office/word/2012/wordml" xmlns:w16cex="http://schemas.microsoft.com/office/word/2018/wordml/cex" xmlns:w16cid="http://schemas.microsoft.com/office/word/2016/wordml/cid" xmlns:w16="http://schemas.microsoft.com/office/word/2018/wordml" xmlns:w16sdtdh="http://schemas.microsoft.com/office/word/2020/wordml/sdtdatahash" xmlns:w16sdtfl="http://schemas.microsoft.com/office/word/2024/wordml/sdtformatlock" xmlns:w16se="http://schemas.microsoft.com/office/word/2015/wordml/symex" xmlns:w16du="http://schemas.microsoft.com/office/word/2023/wordml/word16du" mc:Ignorable="w14 w15 w16se w16cid w16 w16cex w16sdtdh w16sdtfl w16du">
   <w:docDefaults>
     <w:rPrDefault>
       <w:rPr>

</xml_diff>

<commit_message>
Restore contract covers and fix table header text
</commit_message>
<xml_diff>
--- a/@Materi Kuliah/Materi_ADW_Tingkat_Lanjut/Kontrak_Perkuliahan_ADWTL_S2_Statistika_Terapan.docx
+++ b/@Materi Kuliah/Materi_ADW_Tingkat_Lanjut/Kontrak_Perkuliahan_ADWTL_S2_Statistika_Terapan.docx
@@ -14,12 +14,38 @@
         </w:rPr>
       </w:pPr>
       <w:r>
-        <w:rPr>
-          <w:rFonts w:ascii="Times New Roman" w:hAnsi="Times New Roman" w:cs="Times New Roman"/>
-          <w:noProof/>
-          <w:color w:val="000000" w:themeColor="text1"/>
-          <w:lang w:val="id-ID"/>
-        </w:rPr>
+        <w:drawing>
+          <wp:inline xmlns:a="http://schemas.openxmlformats.org/drawingml/2006/main" xmlns:pic="http://schemas.openxmlformats.org/drawingml/2006/picture">
+            <wp:extent cx="7556500" cy="10680700"/>
+            <wp:docPr id="1" name="Picture 1"/>
+            <wp:cNvGraphicFramePr>
+              <a:graphicFrameLocks noChangeAspect="1"/>
+            </wp:cNvGraphicFramePr>
+            <a:graphic>
+              <a:graphicData uri="http://schemas.openxmlformats.org/drawingml/2006/picture">
+                <pic:pic>
+                  <pic:nvPicPr>
+                    <pic:cNvPr id="0" name="image.png"/>
+                    <pic:cNvPicPr/>
+                  </pic:nvPicPr>
+                  <pic:blipFill>
+                    <a:blip r:embed="rId8"/>
+                    <a:stretch>
+                      <a:fillRect/>
+                    </a:stretch>
+                  </pic:blipFill>
+                  <pic:spPr>
+                    <a:xfrm>
+                      <a:off x="0" y="0"/>
+                      <a:ext cx="7556500" cy="10680700"/>
+                    </a:xfrm>
+                    <a:prstGeom prst="rect"/>
+                  </pic:spPr>
+                </pic:pic>
+              </a:graphicData>
+            </a:graphic>
+          </wp:inline>
+        </w:drawing>
       </w:r>
     </w:p>
     <w:p>
@@ -1303,7 +1329,7 @@
                 <w:rFonts w:ascii="Times New Roman" w:hAnsi="Times New Roman" w:cs="Times New Roman"/>
                 <w:b/>
                 <w:noProof/>
-                <w:color w:val="000000" w:themeColor="text1"/>
+                <w:color w:val="FFFFFF"/>
                 <w:sz w:val="18"/>
                 <w:lang w:val="id-ID"/>
               </w:rPr>
@@ -1338,7 +1364,7 @@
                 <w:rFonts w:ascii="Times New Roman" w:hAnsi="Times New Roman" w:cs="Times New Roman"/>
                 <w:b/>
                 <w:noProof/>
-                <w:color w:val="000000" w:themeColor="text1"/>
+                <w:color w:val="FFFFFF"/>
                 <w:sz w:val="18"/>
                 <w:lang w:val="id-ID"/>
               </w:rPr>
@@ -1761,7 +1787,7 @@
                 <w:rFonts w:ascii="Times New Roman" w:hAnsi="Times New Roman" w:cs="Times New Roman"/>
                 <w:b/>
                 <w:noProof/>
-                <w:color w:val="000000" w:themeColor="text1"/>
+                <w:color w:val="FFFFFF"/>
                 <w:sz w:val="16"/>
                 <w:lang w:val="id-ID"/>
               </w:rPr>
@@ -1796,7 +1822,7 @@
                 <w:rFonts w:ascii="Times New Roman" w:hAnsi="Times New Roman" w:cs="Times New Roman"/>
                 <w:b/>
                 <w:noProof/>
-                <w:color w:val="000000" w:themeColor="text1"/>
+                <w:color w:val="FFFFFF"/>
                 <w:sz w:val="16"/>
                 <w:lang w:val="id-ID"/>
               </w:rPr>
@@ -1831,7 +1857,7 @@
                 <w:rFonts w:ascii="Times New Roman" w:hAnsi="Times New Roman" w:cs="Times New Roman"/>
                 <w:b/>
                 <w:noProof/>
-                <w:color w:val="000000" w:themeColor="text1"/>
+                <w:color w:val="FFFFFF"/>
                 <w:sz w:val="16"/>
                 <w:lang w:val="id-ID"/>
               </w:rPr>
@@ -2445,7 +2471,7 @@
                 <w:rFonts w:ascii="Times New Roman" w:hAnsi="Times New Roman" w:cs="Times New Roman"/>
                 <w:b/>
                 <w:noProof/>
-                <w:color w:val="000000" w:themeColor="text1"/>
+                <w:color w:val="FFFFFF"/>
                 <w:sz w:val="17"/>
                 <w:lang w:val="id-ID"/>
               </w:rPr>
@@ -2480,7 +2506,7 @@
                 <w:rFonts w:ascii="Times New Roman" w:hAnsi="Times New Roman" w:cs="Times New Roman"/>
                 <w:b/>
                 <w:noProof/>
-                <w:color w:val="000000" w:themeColor="text1"/>
+                <w:color w:val="FFFFFF"/>
                 <w:sz w:val="17"/>
                 <w:lang w:val="id-ID"/>
               </w:rPr>
@@ -2515,7 +2541,7 @@
                 <w:rFonts w:ascii="Times New Roman" w:hAnsi="Times New Roman" w:cs="Times New Roman"/>
                 <w:b/>
                 <w:noProof/>
-                <w:color w:val="000000" w:themeColor="text1"/>
+                <w:color w:val="FFFFFF"/>
                 <w:sz w:val="17"/>
                 <w:lang w:val="id-ID"/>
               </w:rPr>
@@ -3549,7 +3575,7 @@
                 <w:rFonts w:ascii="Times New Roman" w:hAnsi="Times New Roman" w:cs="Times New Roman"/>
                 <w:b/>
                 <w:noProof/>
-                <w:color w:val="000000" w:themeColor="text1"/>
+                <w:color w:val="FFFFFF"/>
                 <w:sz w:val="14"/>
                 <w:lang w:val="id-ID"/>
               </w:rPr>
@@ -3584,7 +3610,7 @@
                 <w:rFonts w:ascii="Times New Roman" w:hAnsi="Times New Roman" w:cs="Times New Roman"/>
                 <w:b/>
                 <w:noProof/>
-                <w:color w:val="000000" w:themeColor="text1"/>
+                <w:color w:val="FFFFFF"/>
                 <w:sz w:val="14"/>
                 <w:lang w:val="id-ID"/>
               </w:rPr>
@@ -3619,7 +3645,7 @@
                 <w:rFonts w:ascii="Times New Roman" w:hAnsi="Times New Roman" w:cs="Times New Roman"/>
                 <w:b/>
                 <w:noProof/>
-                <w:color w:val="000000" w:themeColor="text1"/>
+                <w:color w:val="FFFFFF"/>
                 <w:sz w:val="14"/>
                 <w:lang w:val="id-ID"/>
               </w:rPr>
@@ -3654,7 +3680,7 @@
                 <w:rFonts w:ascii="Times New Roman" w:hAnsi="Times New Roman" w:cs="Times New Roman"/>
                 <w:b/>
                 <w:noProof/>
-                <w:color w:val="000000" w:themeColor="text1"/>
+                <w:color w:val="FFFFFF"/>
                 <w:sz w:val="14"/>
                 <w:lang w:val="id-ID"/>
               </w:rPr>
@@ -3689,7 +3715,7 @@
                 <w:rFonts w:ascii="Times New Roman" w:hAnsi="Times New Roman" w:cs="Times New Roman"/>
                 <w:b/>
                 <w:noProof/>
-                <w:color w:val="000000" w:themeColor="text1"/>
+                <w:color w:val="FFFFFF"/>
                 <w:sz w:val="14"/>
                 <w:lang w:val="id-ID"/>
               </w:rPr>
@@ -5116,7 +5142,7 @@
                 <w:rFonts w:ascii="Times New Roman" w:hAnsi="Times New Roman" w:cs="Times New Roman"/>
                 <w:b/>
                 <w:noProof/>
-                <w:color w:val="000000" w:themeColor="text1"/>
+                <w:color w:val="FFFFFF"/>
                 <w:sz w:val="14"/>
                 <w:lang w:val="id-ID"/>
               </w:rPr>
@@ -5151,7 +5177,7 @@
                 <w:rFonts w:ascii="Times New Roman" w:hAnsi="Times New Roman" w:cs="Times New Roman"/>
                 <w:b/>
                 <w:noProof/>
-                <w:color w:val="000000" w:themeColor="text1"/>
+                <w:color w:val="FFFFFF"/>
                 <w:sz w:val="14"/>
                 <w:lang w:val="id-ID"/>
               </w:rPr>
@@ -5186,7 +5212,7 @@
                 <w:rFonts w:ascii="Times New Roman" w:hAnsi="Times New Roman" w:cs="Times New Roman"/>
                 <w:b/>
                 <w:noProof/>
-                <w:color w:val="000000" w:themeColor="text1"/>
+                <w:color w:val="FFFFFF"/>
                 <w:sz w:val="14"/>
                 <w:lang w:val="id-ID"/>
               </w:rPr>
@@ -5221,7 +5247,7 @@
                 <w:rFonts w:ascii="Times New Roman" w:hAnsi="Times New Roman" w:cs="Times New Roman"/>
                 <w:b/>
                 <w:noProof/>
-                <w:color w:val="000000" w:themeColor="text1"/>
+                <w:color w:val="FFFFFF"/>
                 <w:sz w:val="14"/>
                 <w:lang w:val="id-ID"/>
               </w:rPr>
@@ -5256,7 +5282,7 @@
                 <w:rFonts w:ascii="Times New Roman" w:hAnsi="Times New Roman" w:cs="Times New Roman"/>
                 <w:b/>
                 <w:noProof/>
-                <w:color w:val="000000" w:themeColor="text1"/>
+                <w:color w:val="FFFFFF"/>
                 <w:sz w:val="14"/>
                 <w:lang w:val="id-ID"/>
               </w:rPr>
@@ -6711,7 +6737,7 @@
                 <w:rFonts w:ascii="Times New Roman" w:hAnsi="Times New Roman" w:cs="Times New Roman"/>
                 <w:b/>
                 <w:noProof/>
-                <w:color w:val="000000" w:themeColor="text1"/>
+                <w:color w:val="FFFFFF"/>
                 <w:sz w:val="16"/>
                 <w:lang w:val="id-ID"/>
               </w:rPr>
@@ -6746,7 +6772,7 @@
                 <w:rFonts w:ascii="Times New Roman" w:hAnsi="Times New Roman" w:cs="Times New Roman"/>
                 <w:b/>
                 <w:noProof/>
-                <w:color w:val="000000" w:themeColor="text1"/>
+                <w:color w:val="FFFFFF"/>
                 <w:sz w:val="16"/>
                 <w:lang w:val="id-ID"/>
               </w:rPr>
@@ -6781,7 +6807,7 @@
                 <w:rFonts w:ascii="Times New Roman" w:hAnsi="Times New Roman" w:cs="Times New Roman"/>
                 <w:b/>
                 <w:noProof/>
-                <w:color w:val="000000" w:themeColor="text1"/>
+                <w:color w:val="FFFFFF"/>
                 <w:sz w:val="16"/>
                 <w:lang w:val="id-ID"/>
               </w:rPr>
@@ -6816,7 +6842,7 @@
                 <w:rFonts w:ascii="Times New Roman" w:hAnsi="Times New Roman" w:cs="Times New Roman"/>
                 <w:b/>
                 <w:noProof/>
-                <w:color w:val="000000" w:themeColor="text1"/>
+                <w:color w:val="FFFFFF"/>
                 <w:sz w:val="16"/>
                 <w:lang w:val="id-ID"/>
               </w:rPr>
@@ -7584,7 +7610,7 @@
                 <w:rFonts w:ascii="Times New Roman" w:hAnsi="Times New Roman" w:cs="Times New Roman"/>
                 <w:b/>
                 <w:noProof/>
-                <w:color w:val="000000" w:themeColor="text1"/>
+                <w:color w:val="FFFFFF"/>
                 <w:sz w:val="17"/>
                 <w:lang w:val="id-ID"/>
               </w:rPr>
@@ -7619,7 +7645,7 @@
                 <w:rFonts w:ascii="Times New Roman" w:hAnsi="Times New Roman" w:cs="Times New Roman"/>
                 <w:b/>
                 <w:noProof/>
-                <w:color w:val="000000" w:themeColor="text1"/>
+                <w:color w:val="FFFFFF"/>
                 <w:sz w:val="17"/>
                 <w:lang w:val="id-ID"/>
               </w:rPr>
@@ -7654,7 +7680,7 @@
                 <w:rFonts w:ascii="Times New Roman" w:hAnsi="Times New Roman" w:cs="Times New Roman"/>
                 <w:b/>
                 <w:noProof/>
-                <w:color w:val="000000" w:themeColor="text1"/>
+                <w:color w:val="FFFFFF"/>
                 <w:sz w:val="17"/>
                 <w:lang w:val="id-ID"/>
               </w:rPr>
@@ -8250,7 +8276,7 @@
                 <w:rFonts w:ascii="Times New Roman" w:hAnsi="Times New Roman" w:cs="Times New Roman"/>
                 <w:b/>
                 <w:noProof/>
-                <w:color w:val="000000" w:themeColor="text1"/>
+                <w:color w:val="FFFFFF"/>
                 <w:sz w:val="16"/>
                 <w:lang w:val="id-ID"/>
               </w:rPr>
@@ -8285,7 +8311,7 @@
                 <w:rFonts w:ascii="Times New Roman" w:hAnsi="Times New Roman" w:cs="Times New Roman"/>
                 <w:b/>
                 <w:noProof/>
-                <w:color w:val="000000" w:themeColor="text1"/>
+                <w:color w:val="FFFFFF"/>
                 <w:sz w:val="16"/>
                 <w:lang w:val="id-ID"/>
               </w:rPr>
@@ -8320,7 +8346,7 @@
                 <w:rFonts w:ascii="Times New Roman" w:hAnsi="Times New Roman" w:cs="Times New Roman"/>
                 <w:b/>
                 <w:noProof/>
-                <w:color w:val="000000" w:themeColor="text1"/>
+                <w:color w:val="FFFFFF"/>
                 <w:sz w:val="16"/>
                 <w:lang w:val="id-ID"/>
               </w:rPr>
@@ -9430,7 +9456,7 @@
                 <w:rFonts w:ascii="Times New Roman" w:hAnsi="Times New Roman" w:cs="Times New Roman"/>
                 <w:b/>
                 <w:noProof/>
-                <w:color w:val="000000" w:themeColor="text1"/>
+                <w:color w:val="FFFFFF"/>
                 <w:sz w:val="16"/>
                 <w:lang w:val="id-ID"/>
               </w:rPr>
@@ -9465,7 +9491,7 @@
                 <w:rFonts w:ascii="Times New Roman" w:hAnsi="Times New Roman" w:cs="Times New Roman"/>
                 <w:b/>
                 <w:noProof/>
-                <w:color w:val="000000" w:themeColor="text1"/>
+                <w:color w:val="FFFFFF"/>
                 <w:sz w:val="16"/>
                 <w:lang w:val="id-ID"/>
               </w:rPr>
@@ -9777,7 +9803,7 @@
                 <w:rFonts w:ascii="Times New Roman" w:hAnsi="Times New Roman" w:cs="Times New Roman"/>
                 <w:b/>
                 <w:noProof/>
-                <w:color w:val="000000" w:themeColor="text1"/>
+                <w:color w:val="FFFFFF"/>
                 <w:sz w:val="17"/>
                 <w:lang w:val="id-ID"/>
               </w:rPr>
@@ -9812,7 +9838,7 @@
                 <w:rFonts w:ascii="Times New Roman" w:hAnsi="Times New Roman" w:cs="Times New Roman"/>
                 <w:b/>
                 <w:noProof/>
-                <w:color w:val="000000" w:themeColor="text1"/>
+                <w:color w:val="FFFFFF"/>
                 <w:sz w:val="17"/>
                 <w:lang w:val="id-ID"/>
               </w:rPr>
@@ -10731,7 +10757,7 @@
                 <w:rFonts w:ascii="Times New Roman" w:hAnsi="Times New Roman" w:cs="Times New Roman"/>
                 <w:b/>
                 <w:noProof/>
-                <w:color w:val="000000" w:themeColor="text1"/>
+                <w:color w:val="FFFFFF"/>
                 <w:sz w:val="17"/>
                 <w:lang w:val="id-ID"/>
               </w:rPr>
@@ -10766,7 +10792,7 @@
                 <w:rFonts w:ascii="Times New Roman" w:hAnsi="Times New Roman" w:cs="Times New Roman"/>
                 <w:b/>
                 <w:noProof/>
-                <w:color w:val="000000" w:themeColor="text1"/>
+                <w:color w:val="FFFFFF"/>
                 <w:sz w:val="17"/>
                 <w:lang w:val="id-ID"/>
               </w:rPr>

</xml_diff>